<commit_message>
fix(paper-02): v1.5 - oo v1.5核查报告5项修复
Fix1 §4.1: Konrad时序 "within days of birth"→"before substantial postnatal experience"
  Ramphal单独标注为"full-term within four days"，McKinnon/Konrad归为NICU preterm组
Fix2 §4.3.2: 同上修正，保持两处表述一致
Fix3 引用: Davies(2019)→Branigan et al.(2013) Social Forces教育遗传率meta-analysis
  参考文献同步更新
Fix4 §4.5: 删除无纳入研究支撑的"DMN connectivity"（两处），
  段末同步删除"DMN"
Fix5 版本号v1.4→v1.5，Status说明更新
     补充5条参考文献缺失DOI:
     Hoff(2013)/Knickmeyer(2008)/McEwen&Gianaros(2010)/Noble(2015)/Stiles&Jernigan(2010)

Co-Authored-By: Claude Sonnet 4.6 (1M context) <noreply@anthropic.com>
</commit_message>
<xml_diff>
--- a/projects/paper-02/06-write/老师指导后完善/paper02_draft_v4_1.docx
+++ b/projects/paper-02/06-write/老师指导后完善/paper02_draft_v4_1.docx
@@ -7323,7 +7323,7 @@
           <w:i w:val="0"/>
           <w:sz w:val="24"/>
         </w:rPr>
-        <w:t xml:space="preserve">Two structural findings are particularly notable from a developmental neuroscience perspective. First, parental education associations with neural outcomes were detectable in neonates assessed within days of birth (McKinnon et al., 2023; Ramphal et al., 2020; Konrad et al., 2024), consistent with </w:t>
+        <w:t xml:space="preserve">Two structural findings are particularly notable from a developmental neuroscience perspective. First, parental education associations with neural outcomes were detectable before substantial postnatal experience had accrued—including in one study scanning full-term infants within four days of birth (Ramphal et al., 2020), and in two studies of very preterm infants assessed during the NICU period (McKinnon et al., 2023; Konrad et al., 2024)—consistent with </w:t>
       </w:r>
       <w:r>
         <w:rPr>
@@ -8026,7 +8026,7 @@
           <w:i w:val="0"/>
           <w:sz w:val="24"/>
         </w:rPr>
-        <w:t xml:space="preserve"> The evidence base is most concentrated in this period. Three neonatal studies (McKinnon et al., 2023; Ramphal et al., 2020; Konrad et al., 2024) established associations detectable at or within days of birth, consistent with prenatal origins. A further six studies examined infants and toddlers up to approximately 2 years of age (Wienke et al., 2024; Brito &amp; Noble, 2020; Turesky et al., 2022; Shephard et al., 2019; Conejero et al., 2018; Stiver et al., 2015), spanning EEG, ERP, DTI, and structural MRI modalities. Eight of the nine studies in this window reported positive associations; the single exception (Wienke et al., 2024) is attributable to migration-related contextual factors as discussed in Section 4.3.3.</w:t>
+        <w:t xml:space="preserve"> The evidence base is most concentrated in this period. Three neonatal studies established associations detectable before substantial postnatal experience had accrued: one scanning full-term infants within four days of birth (Ramphal et al., 2020) and two examining very preterm infants during the NICU period at term-equivalent age (McKinnon et al., 2023; Konrad et al., 2024), all consistent with prenatal origins. A further six studies examined infants and toddlers up to approximately 2 years of age (Wienke et al., 2024; Brito &amp; Noble, 2020; Turesky et al., 2022; Shephard et al., 2019; Conejero et al., 2018; Stiver et al., 2015), spanning EEG, ERP, DTI, and structural MRI modalities. Eight of the nine studies in this window reported positive associations; the single exception (Wienke et al., 2024) is attributable to migration-related contextual factors as discussed in Section 4.3.3.</w:t>
       </w:r>
     </w:p>
     <w:p>
@@ -8607,7 +8607,7 @@
           <w:i w:val="0"/>
           <w:sz w:val="24"/>
         </w:rPr>
-        <w:t>The convergence of parental education associations across frontal and temporal neural systems—regardless of modality—supports a coherent account centered on prefrontal and perisylvian circuitry. In ERP studies, the most consistent finding was greater frontal activation (larger ERN amplitude at fronto-central electrodes) in children of more educated parents. In fNIRS, greater inferior frontal gyrus activation was found. In fMRI, effects clustered in medial prefrontal cortex (amygdala–PFC connectivity; DMN connectivity) and left inferior frontal gyrus (language network). In DTI, the arcuate fasciculus—projecting between inferior frontal and superior temporal cortex—was the most consistently implicated tract. In structural MRI, effects included frontal, parietal, and temporal surface area. Together, these findings converge on a fronto-temporal network encompassing language-processing regions (Broca's area, Wernicke's area, arcuate fasciculus) and executive/affective regulation regions (anterior cingulate, medial prefrontal cortex, DMN).</w:t>
+        <w:t>The convergence of parental education associations across frontal and temporal neural systems—regardless of modality—supports a coherent account centered on prefrontal and perisylvian circuitry. In ERP studies, the most consistent finding was greater frontal activation (larger ERN amplitude at fronto-central electrodes) in children of more educated parents. In fNIRS, greater inferior frontal gyrus activation was found. In fMRI, effects clustered in medial prefrontal cortex (amygdala–PFC connectivity) and left inferior frontal gyrus (language network). In DTI, the arcuate fasciculus—projecting between inferior frontal and superior temporal cortex—was the most consistently implicated tract. In structural MRI, effects included frontal, parietal, and temporal surface area. Together, these findings converge on a fronto-temporal network encompassing language-processing regions (Broca's area, Wernicke's area, arcuate fasciculus) and executive/affective regulation regions (anterior cingulate, medial prefrontal cortex).</w:t>
       </w:r>
     </w:p>
     <w:p>
@@ -8825,7 +8825,7 @@
           <w:i w:val="0"/>
           <w:sz w:val="24"/>
         </w:rPr>
-        <w:t>All included studies employed observational designs that cannot rule out genetic confounding via passive gene–environment correlation. Parental education is moderately heritable (~40%), and children of more educated parents inherit both genetic predispositions for cognitive development and enriched environments (Plomin et al., 2013; Davies et al., 2019). None of the included studies used designs—such as monozygotic twin comparisons, adoption studies, or polygenic score-controlled analyses—that could disentangle genetic from environmental pathways. The observed neural associations may therefore partly reflect shared genetic variance between parent and child rather than purely environmental transmission. Future studies employing genetically informed designs would substantially strengthen causal inference.</w:t>
+        <w:t>All included studies employed observational designs that cannot rule out genetic confounding via passive gene–environment correlation. Parental education is moderately heritable (~40%), and children of more educated parents inherit both genetic predispositions for cognitive development and enriched environments (Plomin et al., 2013; Branigan et al., 2013). None of the included studies used designs—such as monozygotic twin comparisons, adoption studies, or polygenic score-controlled analyses—that could disentangle genetic from environmental pathways. The observed neural associations may therefore partly reflect shared genetic variance between parent and child rather than purely environmental transmission. Future studies employing genetically informed designs would substantially strengthen causal inference.</w:t>
       </w:r>
     </w:p>
     <w:p>
@@ -9543,7 +9543,7 @@
           <w:i w:val="0"/>
           <w:sz w:val="24"/>
         </w:rPr>
-        <w:t xml:space="preserve">Davies, N. M., Dickson, M., Smith, G. D., van den Berg, G. J., &amp; Windmeijer, F. (2019). The causal effects of education on health outcomes in the UK Biobank. </w:t>
+        <w:t xml:space="preserve">Branigan, A. R., McCallum, K. J., &amp; Freese, J. (2013). Variation in the heritability of educational attainment: An international meta-analysis. </w:t>
       </w:r>
       <w:r>
         <w:rPr>
@@ -9552,7 +9552,7 @@
           <w:i/>
           <w:sz w:val="24"/>
         </w:rPr>
-        <w:t>Nature Human Behaviour</w:t>
+        <w:t>Social Forces</w:t>
       </w:r>
       <w:r>
         <w:rPr>
@@ -9570,16 +9570,16 @@
           <w:i/>
           <w:sz w:val="24"/>
         </w:rPr>
-        <w:t>2</w:t>
-      </w:r>
-      <w:r>
-        <w:rPr>
-          <w:rFonts w:ascii="Times New Roman" w:hAnsi="Times New Roman"/>
-          <w:b w:val="0"/>
-          <w:i w:val="0"/>
-          <w:sz w:val="24"/>
-        </w:rPr>
-        <w:t>(2), 117–125. https://doi.org/10.1038/s41562-017-0279-y</w:t>
+        <w:t>92</w:t>
+      </w:r>
+      <w:r>
+        <w:rPr>
+          <w:rFonts w:ascii="Times New Roman" w:hAnsi="Times New Roman"/>
+          <w:b w:val="0"/>
+          <w:i w:val="0"/>
+          <w:sz w:val="24"/>
+        </w:rPr>
+        <w:t>(1), 109–140. https://doi.org/10.1093/sf/sot076</w:t>
       </w:r>
     </w:p>
     <w:p>
@@ -9783,7 +9783,7 @@
           <w:i w:val="0"/>
           <w:sz w:val="24"/>
         </w:rPr>
-        <w:t>(1), 4–14.</w:t>
+        <w:t>(1), 4–14. https://doi.org/10.1037/a0030612</w:t>
       </w:r>
     </w:p>
     <w:p>
@@ -9834,7 +9834,7 @@
           <w:i w:val="0"/>
           <w:sz w:val="24"/>
         </w:rPr>
-        <w:t>(47), 12176–12182.</w:t>
+        <w:t>(47), 12176–12182. https://doi.org/10.1523/JNEUROSCI.3479-08.2008</w:t>
       </w:r>
     </w:p>
     <w:p>
@@ -9987,7 +9987,7 @@
           <w:i w:val="0"/>
           <w:sz w:val="24"/>
         </w:rPr>
-        <w:t>, 190–222.</w:t>
+        <w:t>, 190–222. https://doi.org/10.1111/j.1749-6632.2009.05437.x</w:t>
       </w:r>
     </w:p>
     <w:p>
@@ -10089,7 +10089,7 @@
           <w:i w:val="0"/>
           <w:sz w:val="24"/>
         </w:rPr>
-        <w:t>(5), 773–778.</w:t>
+        <w:t>(5), 773–778. https://doi.org/10.1038/nn.3983</w:t>
       </w:r>
     </w:p>
     <w:p>
@@ -10242,7 +10242,7 @@
           <w:i w:val="0"/>
           <w:sz w:val="24"/>
         </w:rPr>
-        <w:t>(4), 327–348.</w:t>
+        <w:t>(4), 327–348. https://doi.org/10.1007/s11065-010-9148-4</w:t>
       </w:r>
     </w:p>
     <w:p>

</xml_diff>

<commit_message>
fix(paper-02): v1.6 - oo深度核查9项修复
🔴 必改3项:
Fix1 §3.6.3: Konrad"at birth"最后残留→"prior to substantial postnatal experience"
Fix2 Abstract Results: "detectable from birth"→"before substantial postnatal experience"
Fix3 Conejero §3.3.2全面修正:
  - 任务范式: go/no-go → puzzle error observation paradigm
  - N: 56→52（最终可分析样本）；年龄: 12-30m→16-18m
  - 效应量: β=.355(composite SES) → β=.31(parental education独立效应)
  - 补充theta power边缘结果(β=.25, p=.07)
  - Table 1同步更新N和年龄

🟡 建议改4项:
Fix4 §4.3.2 Infancy段末补充Zhu双窗口说明
Fix5 §4.6 "10 countries"→"10 countries or regions"
Fix6 Table 2注释: 补充Lange归类逻辑说明
Fix7 版本号v1.5→v1.6，Status更新

🟢 可选:
Fix8 Tomalski&Johnson(2010)补充DOI
Fix9 figure2/4数据同步: Conejero N=56→52，年龄范围修正

Co-Authored-By: Claude Sonnet 4.6 (1M context) <noreply@anthropic.com>
</commit_message>
<xml_diff>
--- a/projects/paper-02/06-write/老师指导后完善/paper02_draft_v4_1.docx
+++ b/projects/paper-02/06-write/老师指导后完善/paper02_draft_v4_1.docx
@@ -141,7 +141,7 @@
           <w:i w:val="0"/>
           <w:sz w:val="24"/>
         </w:rPr>
-        <w:t xml:space="preserve"> = 26–373; 10 countries) met inclusion criteria. Across six modalities, 15 of 16 (94%) reported a positive association between higher parental education and more mature neural indices; three neonatal studies indicated associations detectable from birth. One study reported a negative pattern attributable to migration-related linguistic heterogeneity.</w:t>
+        <w:t xml:space="preserve"> = 26–373; 10 countries) met inclusion criteria. Across six modalities, 15 of 16 (94%) reported a positive association between higher parental education and more mature neural indices; three neonatal studies indicated associations detectable before substantial postnatal experience had accrued. One study reported a negative pattern attributable to migration-related linguistic heterogeneity.</w:t>
       </w:r>
     </w:p>
     <w:p>
@@ -5036,7 +5036,7 @@
                 <w:i w:val="0"/>
                 <w:sz w:val="20"/>
               </w:rPr>
-              <w:t>56</w:t>
+              <w:t>52</w:t>
             </w:r>
           </w:p>
         </w:tc>
@@ -5063,7 +5063,7 @@
                 <w:i w:val="0"/>
                 <w:sz w:val="20"/>
               </w:rPr>
-              <w:t>12–30 months</w:t>
+              <w:t>16–18 months</w:t>
             </w:r>
           </w:p>
         </w:tc>
@@ -6111,7 +6111,7 @@
           <w:i w:val="0"/>
           <w:sz w:val="24"/>
         </w:rPr>
-        <w:t xml:space="preserve"> examined error-related negativity (ERN), an ERP component indexing error monitoring and prefrontal cognitive control, in 56 toddlers (aged 12–30 months) in Spain. Error monitoring was assessed during a go/no-go task, and parental education (years of schooling) was the primary exposure variable. Higher parental education predicted a larger (more negative) ERN amplitude, reflecting stronger neural responses to errors (</w:t>
+        <w:t xml:space="preserve"> examined error-monitoring neural responses in 52 toddlers (aged 16–18 months; final analysable sample after exclusions) in Spain. Using a passive puzzle-error observation paradigm—in which toddlers watched puzzle pieces being assembled correctly or incorrectly—the study recorded both the error-related negativity (ERN; a fronto-central time-domain component) and frontal theta power (4–7 Hz; a frequency-domain measure of the same error-detection process). Parental education (years of schooling) independently predicted a larger (more negative) ERN amplitude (</w:t>
       </w:r>
       <w:r>
         <w:rPr>
@@ -6129,6 +6129,114 @@
           <w:i w:val="0"/>
           <w:sz w:val="24"/>
         </w:rPr>
+        <w:t xml:space="preserve"> = .31, </w:t>
+      </w:r>
+      <w:r>
+        <w:rPr>
+          <w:rFonts w:ascii="Times New Roman" w:hAnsi="Times New Roman"/>
+          <w:b w:val="0"/>
+          <w:i/>
+          <w:sz w:val="24"/>
+        </w:rPr>
+        <w:t>F</w:t>
+      </w:r>
+      <w:r>
+        <w:rPr>
+          <w:rFonts w:ascii="Times New Roman" w:hAnsi="Times New Roman"/>
+          <w:b w:val="0"/>
+          <w:i w:val="0"/>
+          <w:sz w:val="24"/>
+        </w:rPr>
+        <w:t xml:space="preserve">(1, 51) = 5.03, </w:t>
+      </w:r>
+      <w:r>
+        <w:rPr>
+          <w:rFonts w:ascii="Times New Roman" w:hAnsi="Times New Roman"/>
+          <w:b w:val="0"/>
+          <w:i/>
+          <w:sz w:val="24"/>
+        </w:rPr>
+        <w:t>p</w:t>
+      </w:r>
+      <w:r>
+        <w:rPr>
+          <w:rFonts w:ascii="Times New Roman" w:hAnsi="Times New Roman"/>
+          <w:b w:val="0"/>
+          <w:i w:val="0"/>
+          <w:sz w:val="24"/>
+        </w:rPr>
+        <w:t xml:space="preserve"> &lt; .05; </w:t>
+      </w:r>
+      <w:r>
+        <w:rPr>
+          <w:rFonts w:ascii="Times New Roman" w:hAnsi="Times New Roman"/>
+          <w:b w:val="0"/>
+          <w:i/>
+          <w:sz w:val="24"/>
+        </w:rPr>
+        <w:t>R²</w:t>
+      </w:r>
+      <w:r>
+        <w:rPr>
+          <w:rFonts w:ascii="Times New Roman" w:hAnsi="Times New Roman"/>
+          <w:b w:val="0"/>
+          <w:i w:val="0"/>
+          <w:sz w:val="24"/>
+        </w:rPr>
+        <w:t xml:space="preserve"> = .10) and showed a marginal association with greater frontal theta power (</w:t>
+      </w:r>
+      <w:r>
+        <w:rPr>
+          <w:rFonts w:ascii="Times New Roman" w:hAnsi="Times New Roman"/>
+          <w:b w:val="0"/>
+          <w:i/>
+          <w:sz w:val="24"/>
+        </w:rPr>
+        <w:t>β</w:t>
+      </w:r>
+      <w:r>
+        <w:rPr>
+          <w:rFonts w:ascii="Times New Roman" w:hAnsi="Times New Roman"/>
+          <w:b w:val="0"/>
+          <w:i w:val="0"/>
+          <w:sz w:val="24"/>
+        </w:rPr>
+        <w:t xml:space="preserve"> = .25, </w:t>
+      </w:r>
+      <w:r>
+        <w:rPr>
+          <w:rFonts w:ascii="Times New Roman" w:hAnsi="Times New Roman"/>
+          <w:b w:val="0"/>
+          <w:i/>
+          <w:sz w:val="24"/>
+        </w:rPr>
+        <w:t>p</w:t>
+      </w:r>
+      <w:r>
+        <w:rPr>
+          <w:rFonts w:ascii="Times New Roman" w:hAnsi="Times New Roman"/>
+          <w:b w:val="0"/>
+          <w:i w:val="0"/>
+          <w:sz w:val="24"/>
+        </w:rPr>
+        <w:t xml:space="preserve"> = .07). The composite SES index (including income and occupation alongside education) accounted for additional variance in ERN (</w:t>
+      </w:r>
+      <w:r>
+        <w:rPr>
+          <w:rFonts w:ascii="Times New Roman" w:hAnsi="Times New Roman"/>
+          <w:b w:val="0"/>
+          <w:i/>
+          <w:sz w:val="24"/>
+        </w:rPr>
+        <w:t>β</w:t>
+      </w:r>
+      <w:r>
+        <w:rPr>
+          <w:rFonts w:ascii="Times New Roman" w:hAnsi="Times New Roman"/>
+          <w:b w:val="0"/>
+          <w:i w:val="0"/>
+          <w:sz w:val="24"/>
+        </w:rPr>
         <w:t xml:space="preserve"> = .355, </w:t>
       </w:r>
       <w:r>
@@ -6165,7 +6273,7 @@
           <w:i w:val="0"/>
           <w:sz w:val="24"/>
         </w:rPr>
-        <w:t xml:space="preserve"> &lt; .05), after controlling for child age and sex. This is notable because the ERN is typically not robust until 5–6 years in Western samples (Davies et al., 2004; Torpey et al., 2009); its detectability in toddlers in this study, and its systematic variation with parental education, implies that the neural substrates of cognitive control begin differentiating by SES-related environmental input within the first two years of life. The ERN finding was localized to fronto-central electrodes (Fz, FCz), consistent with an anterior cingulate cortex generator (van Veen &amp; Carter, 2002), and the effect size was moderate to large.</w:t>
+        <w:t xml:space="preserve"> &lt; .05), indicating that education contributes independently but that broader socioeconomic context adds further explanatory power. This is notable because the ERN is typically not robust until 5–6 years in Western samples (Davies et al., 2004; Torpey et al., 2009); its detectability in toddlers and its systematic variation with parental education implies that the neural substrates of cognitive control begin differentiating by SES-related environmental input within the first two years of life. The ERN finding was localized to fronto-central electrodes (Fz, FCz), consistent with an anterior cingulate cortex generator (van Veen &amp; Carter, 2002).</w:t>
       </w:r>
     </w:p>
     <w:p>
@@ -7230,7 +7338,7 @@
           <w:i w:val="0"/>
           <w:sz w:val="24"/>
         </w:rPr>
-        <w:t>The two pathways are not mutually exclusive and likely operate simultaneously across the developmental period covered by this review. For children assessed at birth and in the neonatal period (McKinnon et al., 2023; Ramphal et al., 2020; Konrad et al., 2024), prenatal mechanisms—operating via maternal stress physiology and nutritional status—likely contribute substantially to the observed parental education associations, given that postnatal environmental experience had not yet accrued at the time of measurement. For children assessed in infancy and beyond (Turesky et al., 2022; Shephard et al., 2019; Maguire &amp; Schneider, 2019; Ozernov-Palchik et al., 2019), both prenatal programming and ongoing postnatal environmental inputs plausibly contribute.</w:t>
+        <w:t>The two pathways are not mutually exclusive and likely operate simultaneously across the developmental period covered by this review. For children assessed prior to the accumulation of substantial postnatal experience—including full-term neonates scanned within days of birth (Ramphal et al., 2020) and very preterm infants assessed during the NICU period (McKinnon et al., 2023; Konrad et al., 2024)—prenatal mechanisms operating via maternal stress physiology and nutritional status likely contribute substantially to the observed parental education associations. For children assessed in infancy and beyond (Turesky et al., 2022; Shephard et al., 2019; Maguire &amp; Schneider, 2019; Ozernov-Palchik et al., 2019), both prenatal programming and ongoing postnatal environmental inputs plausibly contribute.</w:t>
       </w:r>
     </w:p>
     <w:p>
@@ -7973,7 +8081,7 @@
           <w:i w:val="0"/>
           <w:sz w:val="20"/>
         </w:rPr>
-        <w:t xml:space="preserve"> across categories therefore exceeds 16. †Lange et al. (2010) used brain volume as a covariate rather than a primary neural outcome; the primary reported finding was an association between parental education and verbal IQ.</w:t>
+        <w:t xml:space="preserve"> across categories therefore exceeds 16. †Lange et al. (2010) is categorised under global morphometry for tabulation purposes; its primary finding was an association between parental education and verbal IQ, with brain volume included as a covariate rather than a primary neural outcome (see §3.5.1).</w:t>
       </w:r>
     </w:p>
     <w:p>
@@ -8026,7 +8134,7 @@
           <w:i w:val="0"/>
           <w:sz w:val="24"/>
         </w:rPr>
-        <w:t xml:space="preserve"> The evidence base is most concentrated in this period. Three neonatal studies established associations detectable before substantial postnatal experience had accrued: one scanning full-term infants within four days of birth (Ramphal et al., 2020) and two examining very preterm infants during the NICU period at term-equivalent age (McKinnon et al., 2023; Konrad et al., 2024), all consistent with prenatal origins. A further six studies examined infants and toddlers up to approximately 2 years of age (Wienke et al., 2024; Brito &amp; Noble, 2020; Turesky et al., 2022; Shephard et al., 2019; Conejero et al., 2018; Stiver et al., 2015), spanning EEG, ERP, DTI, and structural MRI modalities. Eight of the nine studies in this window reported positive associations; the single exception (Wienke et al., 2024) is attributable to migration-related contextual factors as discussed in Section 4.3.3.</w:t>
+        <w:t xml:space="preserve"> The evidence base is most concentrated in this period. Three neonatal studies established associations detectable before substantial postnatal experience had accrued: one scanning full-term infants within four days of birth (Ramphal et al., 2020) and two examining very preterm infants during the NICU period at term-equivalent age (McKinnon et al., 2023; Konrad et al., 2024), all consistent with prenatal origins. A further six studies examined infants and toddlers up to approximately 2 years of age (Wienke et al., 2024; Brito &amp; Noble, 2020; Turesky et al., 2022; Shephard et al., 2019; Conejero et al., 2018; Stiver et al., 2015), spanning EEG, ERP, DTI, and structural MRI modalities. Eight of the nine studies in this window reported positive associations; the single exception (Wienke et al., 2024) is attributable to migration-related contextual factors as discussed in Section 4.3.3. Zhu et al. (2023), whose longitudinal MRI assessments spanned birth through 8 years, is additionally counted in the Childhood window below.</w:t>
       </w:r>
     </w:p>
     <w:p>
@@ -8696,7 +8804,7 @@
           <w:i w:val="0"/>
           <w:sz w:val="24"/>
         </w:rPr>
-        <w:t>Geographic and cultural concentration is a further limitation. Despite spanning 10 countries, the included studies are heavily concentrated in high-income Western contexts, particularly the United States, United Kingdom, and Canada (10 of 16 studies). Only one study (Wijeakumar et al., 2019) included a sample from a low- or middle-income country, and its cross-cultural design precluded direct inference about non-Western contexts in isolation. The systematic search was also restricted to English-language publications, further limiting coverage of research published in other languages, including Chinese, which would be essential for capturing the substantial and growing neurodevelopmental literature from China. The generalizability of findings to non-Western, non-English-speaking, and low-income country contexts is therefore unknown, and should not be assumed.</w:t>
+        <w:t>Geographic and cultural concentration is a further limitation. Despite spanning 10 countries or regions, the included studies are heavily concentrated in high-income Western contexts, particularly the United States, United Kingdom, and Canada (10 of 16 studies). Only one study (Wijeakumar et al., 2019) included a sample from a low- or middle-income country, and its cross-cultural design precluded direct inference about non-Western contexts in isolation. The systematic search was also restricted to English-language publications, further limiting coverage of research published in other languages, including Chinese, which would be essential for capturing the substantial and growing neurodevelopmental literature from China. The generalizability of findings to non-Western, non-English-speaking, and low-income country contexts is therefore unknown, and should not be assumed.</w:t>
       </w:r>
     </w:p>
     <w:p>
@@ -10293,7 +10401,7 @@
           <w:i w:val="0"/>
           <w:sz w:val="24"/>
         </w:rPr>
-        <w:t>(3), 233–238.</w:t>
+        <w:t>(3), 233–238. https://doi.org/10.1097/YCO.0b013e3283387d9f</w:t>
       </w:r>
     </w:p>
     <w:p>

</xml_diff>

<commit_message>
fix(paper-02): v1.7 - oo深度核查6项修复
🔴 必改:
Fix1 §4.2: "detectable from birth"→"before substantial postnatal experience"
     补充"excluding the three neonatal studies"使七研究计数清晰
Fix2 §3.3.2 Conejero: 三个F(1,51)均明确为独立简单回归
     消除两个β值并列的逻辑矛盾（原写法让读者误以为同一多元回归）

🟡 建议改:
Fix3 §4.3.2: Zhu双窗口→"counted only in Childhood, not in k=9"（消除歧义）
Fix4 Table 1 Conejero Modality: "ERP"→"ERP/EEG"（反映同时测量theta）
Fix5 §2.1 PROSPERO: 被动语态→主动语态("We did not pre-register...")
Fix6 §4.6末: 新增PROSPERO未注册的Limitations声明（PRISMA 2020要求）

版本号v1.6→v1.7

Co-Authored-By: Claude Sonnet 4.6 (1M context) <noreply@anthropic.com>
</commit_message>
<xml_diff>
--- a/projects/paper-02/06-write/老师指导后完善/paper02_draft_v4_1.docx
+++ b/projects/paper-02/06-write/老师指导后完善/paper02_draft_v4_1.docx
@@ -516,7 +516,7 @@
           <w:i w:val="0"/>
           <w:sz w:val="24"/>
         </w:rPr>
-        <w:t>This systematic review was conducted following PRISMA 2020 guidelines (Page et al., 2021). The review was not pre-registered in PROSPERO; a decision was made to proceed without registration given the descriptive, narrative synthesis design and absence of a protocol suitable for prospective registration at the time data collection commenced.</w:t>
+        <w:t>This systematic review was conducted following PRISMA 2020 guidelines (Page et al., 2021). We did not pre-register this review in PROSPERO because the descriptive narrative synthesis design does not lend itself to a prospective protocol, and no formal registration was completed prior to data collection.</w:t>
       </w:r>
     </w:p>
     <w:p>
@@ -5117,7 +5117,7 @@
                 <w:i w:val="0"/>
                 <w:sz w:val="20"/>
               </w:rPr>
-              <w:t>ERP</w:t>
+              <w:t>ERP/EEG</w:t>
             </w:r>
           </w:p>
         </w:tc>
@@ -6111,7 +6111,7 @@
           <w:i w:val="0"/>
           <w:sz w:val="24"/>
         </w:rPr>
-        <w:t xml:space="preserve"> examined error-monitoring neural responses in 52 toddlers (aged 16–18 months; final analysable sample after exclusions) in Spain. Using a passive puzzle-error observation paradigm—in which toddlers watched puzzle pieces being assembled correctly or incorrectly—the study recorded both the error-related negativity (ERN; a fronto-central time-domain component) and frontal theta power (4–7 Hz; a frequency-domain measure of the same error-detection process). Parental education (years of schooling) independently predicted a larger (more negative) ERN amplitude (</w:t>
+        <w:t xml:space="preserve"> examined error-monitoring neural responses in 52 toddlers (aged 16–18 months; final analysable sample after exclusions) in Spain. Using a passive puzzle-error observation paradigm—in which toddlers watched puzzle pieces being assembled correctly or incorrectly—the study recorded both the error-related negativity (ERN; a fronto-central time-domain component) and frontal theta power (4–7 Hz; a frequency-domain measure of the same error-detection process). Separate simple linear regressions were conducted for each SES predictor. When parental education (years of schooling) was entered as the sole predictor, it independently predicted a larger (more negative) ERN amplitude (</w:t>
       </w:r>
       <w:r>
         <w:rPr>
@@ -6183,7 +6183,7 @@
           <w:i w:val="0"/>
           <w:sz w:val="24"/>
         </w:rPr>
-        <w:t xml:space="preserve"> = .10) and showed a marginal association with greater frontal theta power (</w:t>
+        <w:t xml:space="preserve"> = .10); a parallel regression with the composite SES index (combining education, occupation, and income) as the sole predictor accounted for greater variance (</w:t>
       </w:r>
       <w:r>
         <w:rPr>
@@ -6201,6 +6201,78 @@
           <w:i w:val="0"/>
           <w:sz w:val="24"/>
         </w:rPr>
+        <w:t xml:space="preserve"> = .355, </w:t>
+      </w:r>
+      <w:r>
+        <w:rPr>
+          <w:rFonts w:ascii="Times New Roman" w:hAnsi="Times New Roman"/>
+          <w:b w:val="0"/>
+          <w:i/>
+          <w:sz w:val="24"/>
+        </w:rPr>
+        <w:t>F</w:t>
+      </w:r>
+      <w:r>
+        <w:rPr>
+          <w:rFonts w:ascii="Times New Roman" w:hAnsi="Times New Roman"/>
+          <w:b w:val="0"/>
+          <w:i w:val="0"/>
+          <w:sz w:val="24"/>
+        </w:rPr>
+        <w:t xml:space="preserve">(1, 51) = 7.10, </w:t>
+      </w:r>
+      <w:r>
+        <w:rPr>
+          <w:rFonts w:ascii="Times New Roman" w:hAnsi="Times New Roman"/>
+          <w:b w:val="0"/>
+          <w:i/>
+          <w:sz w:val="24"/>
+        </w:rPr>
+        <w:t>p</w:t>
+      </w:r>
+      <w:r>
+        <w:rPr>
+          <w:rFonts w:ascii="Times New Roman" w:hAnsi="Times New Roman"/>
+          <w:b w:val="0"/>
+          <w:i w:val="0"/>
+          <w:sz w:val="24"/>
+        </w:rPr>
+        <w:t xml:space="preserve"> &lt; .05; </w:t>
+      </w:r>
+      <w:r>
+        <w:rPr>
+          <w:rFonts w:ascii="Times New Roman" w:hAnsi="Times New Roman"/>
+          <w:b w:val="0"/>
+          <w:i/>
+          <w:sz w:val="24"/>
+        </w:rPr>
+        <w:t>R²</w:t>
+      </w:r>
+      <w:r>
+        <w:rPr>
+          <w:rFonts w:ascii="Times New Roman" w:hAnsi="Times New Roman"/>
+          <w:b w:val="0"/>
+          <w:i w:val="0"/>
+          <w:sz w:val="24"/>
+        </w:rPr>
+        <w:t xml:space="preserve"> = .13), indicating that education contributes independently but that broader socioeconomic context captures additional explanatory power. Parental education showed a marginal association with frontal theta power in a third separate regression (</w:t>
+      </w:r>
+      <w:r>
+        <w:rPr>
+          <w:rFonts w:ascii="Times New Roman" w:hAnsi="Times New Roman"/>
+          <w:b w:val="0"/>
+          <w:i/>
+          <w:sz w:val="24"/>
+        </w:rPr>
+        <w:t>β</w:t>
+      </w:r>
+      <w:r>
+        <w:rPr>
+          <w:rFonts w:ascii="Times New Roman" w:hAnsi="Times New Roman"/>
+          <w:b w:val="0"/>
+          <w:i w:val="0"/>
+          <w:sz w:val="24"/>
+        </w:rPr>
         <w:t xml:space="preserve"> = .25, </w:t>
       </w:r>
       <w:r>
@@ -6210,6 +6282,24 @@
           <w:i/>
           <w:sz w:val="24"/>
         </w:rPr>
+        <w:t>F</w:t>
+      </w:r>
+      <w:r>
+        <w:rPr>
+          <w:rFonts w:ascii="Times New Roman" w:hAnsi="Times New Roman"/>
+          <w:b w:val="0"/>
+          <w:i w:val="0"/>
+          <w:sz w:val="24"/>
+        </w:rPr>
+        <w:t xml:space="preserve">(1, 51) = 3.47, </w:t>
+      </w:r>
+      <w:r>
+        <w:rPr>
+          <w:rFonts w:ascii="Times New Roman" w:hAnsi="Times New Roman"/>
+          <w:b w:val="0"/>
+          <w:i/>
+          <w:sz w:val="24"/>
+        </w:rPr>
         <w:t>p</w:t>
       </w:r>
       <w:r>
@@ -6219,61 +6309,7 @@
           <w:i w:val="0"/>
           <w:sz w:val="24"/>
         </w:rPr>
-        <w:t xml:space="preserve"> = .07). The composite SES index (including income and occupation alongside education) accounted for additional variance in ERN (</w:t>
-      </w:r>
-      <w:r>
-        <w:rPr>
-          <w:rFonts w:ascii="Times New Roman" w:hAnsi="Times New Roman"/>
-          <w:b w:val="0"/>
-          <w:i/>
-          <w:sz w:val="24"/>
-        </w:rPr>
-        <w:t>β</w:t>
-      </w:r>
-      <w:r>
-        <w:rPr>
-          <w:rFonts w:ascii="Times New Roman" w:hAnsi="Times New Roman"/>
-          <w:b w:val="0"/>
-          <w:i w:val="0"/>
-          <w:sz w:val="24"/>
-        </w:rPr>
-        <w:t xml:space="preserve"> = .355, </w:t>
-      </w:r>
-      <w:r>
-        <w:rPr>
-          <w:rFonts w:ascii="Times New Roman" w:hAnsi="Times New Roman"/>
-          <w:b w:val="0"/>
-          <w:i/>
-          <w:sz w:val="24"/>
-        </w:rPr>
-        <w:t>F</w:t>
-      </w:r>
-      <w:r>
-        <w:rPr>
-          <w:rFonts w:ascii="Times New Roman" w:hAnsi="Times New Roman"/>
-          <w:b w:val="0"/>
-          <w:i w:val="0"/>
-          <w:sz w:val="24"/>
-        </w:rPr>
-        <w:t xml:space="preserve">(1, 51) = 7.10, </w:t>
-      </w:r>
-      <w:r>
-        <w:rPr>
-          <w:rFonts w:ascii="Times New Roman" w:hAnsi="Times New Roman"/>
-          <w:b w:val="0"/>
-          <w:i/>
-          <w:sz w:val="24"/>
-        </w:rPr>
-        <w:t>p</w:t>
-      </w:r>
-      <w:r>
-        <w:rPr>
-          <w:rFonts w:ascii="Times New Roman" w:hAnsi="Times New Roman"/>
-          <w:b w:val="0"/>
-          <w:i w:val="0"/>
-          <w:sz w:val="24"/>
-        </w:rPr>
-        <w:t xml:space="preserve"> &lt; .05), indicating that education contributes independently but that broader socioeconomic context adds further explanatory power. This is notable because the ERN is typically not robust until 5–6 years in Western samples (Davies et al., 2004; Torpey et al., 2009); its detectability in toddlers and its systematic variation with parental education implies that the neural substrates of cognitive control begin differentiating by SES-related environmental input within the first two years of life. The ERN finding was localized to fronto-central electrodes (Fz, FCz), consistent with an anterior cingulate cortex generator (van Veen &amp; Carter, 2002).</w:t>
+        <w:t xml:space="preserve"> = .07). This is notable because the ERN is typically not robust until 5–6 years in Western samples (Davies et al., 2004; Torpey et al., 2009); its detectability in toddlers and its systematic variation with parental education implies that the neural substrates of cognitive control begin differentiating by SES-related environmental input within the first two years of life. The ERN finding was localized to fronto-central electrodes (Fz, FCz), consistent with an anterior cingulate cortex generator (van Veen &amp; Carter, 2002).</w:t>
       </w:r>
     </w:p>
     <w:p>
@@ -7493,7 +7529,7 @@
           <w:i w:val="0"/>
           <w:sz w:val="24"/>
         </w:rPr>
-        <w:t xml:space="preserve">The age distribution of included studies speaks to the question of when in development parental education associations with neural outcomes are first detectable and whether associations are concentrated in particular developmental windows. The neonatal findings (three of 16 studies) establish associations detectable from birth, consistent with </w:t>
+        <w:t xml:space="preserve">The age distribution of included studies speaks to the question of when in development parental education associations with neural outcomes are first detectable and whether associations are concentrated in particular developmental windows. The neonatal findings (three of 16 studies) establish associations detectable before substantial postnatal experience had accrued, consistent with </w:t>
       </w:r>
       <w:r>
         <w:rPr>
@@ -7511,7 +7547,7 @@
           <w:i w:val="0"/>
           <w:sz w:val="24"/>
         </w:rPr>
-        <w:t xml:space="preserve"> origins. The infant and toddler findings (seven studies) indicate that education-related neural differences are already present and widening in the first two years of life—before formal schooling and before most cognitive assessment instruments can be reliably administered. The school-age findings (seven studies, four of which extend beyond 8 years but report primary effects or subgroup analyses within the school-age range) demonstrate that these differences persist into middle childhood, with some evidence that they may be increasing (e.g., Ozernov-Palchik et al., 2019, finding large arcuate FA associations at 5–8 years).</w:t>
+        <w:t xml:space="preserve"> origins. The infant and toddler findings (seven studies, excluding the three neonatal studies) indicate that education-related neural differences are already present and widening in the first two years of life—before formal schooling and before most cognitive assessment instruments can be reliably administered. The school-age findings (seven studies, four of which extend beyond 8 years but report primary effects or subgroup analyses within the school-age range) demonstrate that these differences persist into middle childhood, with some evidence that they may be increasing (e.g., Ozernov-Palchik et al., 2019, finding large arcuate FA associations at 5–8 years).</w:t>
       </w:r>
     </w:p>
     <w:p>
@@ -8134,7 +8170,7 @@
           <w:i w:val="0"/>
           <w:sz w:val="24"/>
         </w:rPr>
-        <w:t xml:space="preserve"> The evidence base is most concentrated in this period. Three neonatal studies established associations detectable before substantial postnatal experience had accrued: one scanning full-term infants within four days of birth (Ramphal et al., 2020) and two examining very preterm infants during the NICU period at term-equivalent age (McKinnon et al., 2023; Konrad et al., 2024), all consistent with prenatal origins. A further six studies examined infants and toddlers up to approximately 2 years of age (Wienke et al., 2024; Brito &amp; Noble, 2020; Turesky et al., 2022; Shephard et al., 2019; Conejero et al., 2018; Stiver et al., 2015), spanning EEG, ERP, DTI, and structural MRI modalities. Eight of the nine studies in this window reported positive associations; the single exception (Wienke et al., 2024) is attributable to migration-related contextual factors as discussed in Section 4.3.3. Zhu et al. (2023), whose longitudinal MRI assessments spanned birth through 8 years, is additionally counted in the Childhood window below.</w:t>
+        <w:t xml:space="preserve"> The evidence base is most concentrated in this period. Three neonatal studies established associations detectable before substantial postnatal experience had accrued: one scanning full-term infants within four days of birth (Ramphal et al., 2020) and two examining very preterm infants during the NICU period at term-equivalent age (McKinnon et al., 2023; Konrad et al., 2024), all consistent with prenatal origins. A further six studies examined infants and toddlers up to approximately 2 years of age (Wienke et al., 2024; Brito &amp; Noble, 2020; Turesky et al., 2022; Shephard et al., 2019; Conejero et al., 2018; Stiver et al., 2015), spanning EEG, ERP, DTI, and structural MRI modalities. Eight of the nine studies in this window reported positive associations; the single exception (Wienke et al., 2024) is attributable to migration-related contextual factors as discussed in Section 4.3.3. Note: Zhu et al. (2023), whose longitudinal MRI assessments spanned birth through 8 years, is counted only in the Childhood window below and is not included in the k = 9 above.</w:t>
       </w:r>
     </w:p>
     <w:p>
@@ -8949,6 +8985,21 @@
           <w:sz w:val="24"/>
         </w:rPr>
         <w:t>Future research priorities identified by this review include: (1) neonatal and infant studies with prospective prenatal education assessment and direct biological pathway measurement (cortisol, language input); (2) studies in East Asian, South Asian, and sub-Saharan African samples with diverse educational systems; (3) multi-site, pre-registered longitudinal designs with sample sizes of ≥200 per wave (Knudsen et al., 2006); and (4) intervention studies—ideally randomized—examining whether parenting programmes targeting language enrichment or stress reduction in low-education families produce detectable changes in neural markers.</w:t>
+      </w:r>
+    </w:p>
+    <w:p>
+      <w:pPr>
+        <w:jc w:val="left"/>
+        <w:spacing w:before="0" w:after="120" w:line="480" w:lineRule="auto"/>
+      </w:pPr>
+      <w:r>
+        <w:rPr>
+          <w:rFonts w:ascii="Times New Roman" w:hAnsi="Times New Roman"/>
+          <w:b w:val="0"/>
+          <w:i w:val="0"/>
+          <w:sz w:val="24"/>
+        </w:rPr>
+        <w:t>Finally, this review was not pre-registered in PROSPERO. As a narrative synthesis without a prospective analysis protocol, formal registration was not completed prior to data collection; this is acknowledged as a limitation in line with PRISMA 2020 transparency standards.</w:t>
       </w:r>
     </w:p>
     <w:p>

</xml_diff>

<commit_message>
fix(paper-02): v1.8 - oo深度核查第四轮7项修复
🔴 必改:
Fix1 §4.7: "detectable from birth"→"emerging as early as the neonatal period"
     (全文最后一处旧措辞，结论段格外显眼)
Fix2 §4.5: ERP描述改为异质性表述
     Conejero(ERN,正向) vs Wienke(MMN,负向)，删除"most consistent"过度概括

🟡 同步处理:
Fix3 §3.1: ERP k=2后加括注"one study also included frontal theta power analysis"
Fix4 Table 2注释: 新增‡标注+Brito语言网络归类依据说明
     §4.3.1正文Brito同步加‡
Fix5 §2.1: 删除草稿内部注释"Methods are largely complete from draft v1.4"
Fix6 References: 全58条按APA 7th字母顺序重排
     (Hoff 2003先于2013; Blair/Bradley/Branigan现在正确排序)
Fix7 版本号v1.7→v1.8

Co-Authored-By: Claude Sonnet 4.6 (1M context) <noreply@anthropic.com>
</commit_message>
<xml_diff>
--- a/projects/paper-02/06-write/老师指导后完善/paper02_draft_v4_1.docx
+++ b/projects/paper-02/06-write/老师指导后完善/paper02_draft_v4_1.docx
@@ -1365,7 +1365,7 @@
           <w:i w:val="0"/>
           <w:sz w:val="24"/>
         </w:rPr>
-        <w:t xml:space="preserve"> = 2), and functional near-infrared spectroscopy (fNIRS; </w:t>
+        <w:t xml:space="preserve"> = 2; one study additionally included frontal theta power analysis), and functional near-infrared spectroscopy (fNIRS; </w:t>
       </w:r>
       <w:r>
         <w:rPr>
@@ -7692,7 +7692,7 @@
           <w:i w:val="0"/>
           <w:sz w:val="24"/>
         </w:rPr>
-        <w:t xml:space="preserve"> (anterior cingulate cortex, medial prefrontal cortex, amygdala–PFC circuitry). Seven of 16 studies implicated language-network regions as primary substrates (Turesky et al., 2022; Ozernov-Palchik et al., 2019; Demir-Lira et al., 2021; Brito &amp; Noble, 2020; Shephard et al., 2019; Maguire &amp; Schneider, 2019; Wienke et al., 2024), while five studies implicated prefrontal executive and stress-regulation circuitry (Conejero et al., 2018; Wijeakumar et al., 2019; Ursache &amp; Noble, 2016; Maguire &amp; Schneider, 2019; Ramphal et al., 2020). The remaining four studies (Stiver et al., 2015; McKinnon et al., 2023; Zhu et al., 2023; Lange et al., 2010) reported effects on global or distributed morphometry rather than specific networks. This pattern is not random: language and executive function are precisely the behavioral domains most reliably associated with parental education in the behavioral literature (Hoff, 2013; Blair &amp; Raver, 2016). The neural system specificity thus supports the theoretical coherence of the observed associations, and suggests that future studies focusing on fronto-temporal language circuitry and prefrontal regulatory networks are most likely to detect reliable parental education effects.</w:t>
+        <w:t xml:space="preserve"> (anterior cingulate cortex, medial prefrontal cortex, amygdala–PFC circuitry). Seven of 16 studies implicated language-network regions as primary substrates (Turesky et al., 2022; Ozernov-Palchik et al., 2019; Demir-Lira et al., 2021; Brito &amp; Noble, 2020‡; Shephard et al., 2019; Maguire &amp; Schneider, 2019; Wienke et al., 2024), while five studies implicated prefrontal executive and stress-regulation circuitry (Conejero et al., 2018; Wijeakumar et al., 2019; Ursache &amp; Noble, 2016; Maguire &amp; Schneider, 2019; Ramphal et al., 2020). The remaining four studies (Stiver et al., 2015; McKinnon et al., 2023; Zhu et al., 2023; Lange et al., 2010) reported effects on global or distributed morphometry rather than specific networks. This pattern is not random: language and executive function are precisely the behavioral domains most reliably associated with parental education in the behavioral literature (Hoff, 2013; Blair &amp; Raver, 2016). The neural system specificity thus supports the theoretical coherence of the observed associations, and suggests that future studies focusing on fronto-temporal language circuitry and prefrontal regulatory networks are most likely to detect reliable parental education effects.</w:t>
       </w:r>
     </w:p>
     <w:p>
@@ -8117,7 +8117,7 @@
           <w:i w:val="0"/>
           <w:sz w:val="20"/>
         </w:rPr>
-        <w:t xml:space="preserve"> across categories therefore exceeds 16. †Lange et al. (2010) is categorised under global morphometry for tabulation purposes; its primary finding was an association between parental education and verbal IQ, with brain volume included as a covariate rather than a primary neural outcome (see §3.5.1).</w:t>
+        <w:t xml:space="preserve"> across categories therefore exceeds 16. †Lange et al. (2010) is categorised under global morphometry for tabulation purposes; its primary finding was an association between parental education and verbal IQ, with brain volume included as a covariate rather than a primary neural outcome (see §3.5.1). ‡Brito &amp; Noble (2020) is included in the language-network category because posterior alpha/beta power in infancy serves as a general index of thalamocortical maturation supporting early language processing (Marshall &amp; Meltzoff, 2014), though this categorisation is indirect; the association also did not survive FDR correction (see §4.3.4).</w:t>
       </w:r>
     </w:p>
     <w:p>
@@ -8751,7 +8751,7 @@
           <w:i w:val="0"/>
           <w:sz w:val="24"/>
         </w:rPr>
-        <w:t>The convergence of parental education associations across frontal and temporal neural systems—regardless of modality—supports a coherent account centered on prefrontal and perisylvian circuitry. In ERP studies, the most consistent finding was greater frontal activation (larger ERN amplitude at fronto-central electrodes) in children of more educated parents. In fNIRS, greater inferior frontal gyrus activation was found. In fMRI, effects clustered in medial prefrontal cortex (amygdala–PFC connectivity) and left inferior frontal gyrus (language network). In DTI, the arcuate fasciculus—projecting between inferior frontal and superior temporal cortex—was the most consistently implicated tract. In structural MRI, effects included frontal, parietal, and temporal surface area. Together, these findings converge on a fronto-temporal network encompassing language-processing regions (Broca's area, Wernicke's area, arcuate fasciculus) and executive/affective regulation regions (anterior cingulate, medial prefrontal cortex).</w:t>
+        <w:t>The convergence of parental education associations across frontal and temporal neural systems—regardless of modality—supports a coherent account centered on prefrontal and perisylvian circuitry. In ERP studies, findings were heterogeneous across the two included studies: Conejero et al. (2018) found larger ERN amplitude at fronto-central electrodes associated with higher parental education, consistent with more advanced error-monitoring development; Wienke et al. (2024), using an MMN paradigm targeting auditory discrimination, produced the review's only negative result. The ERP evidence therefore does not converge on a consistent pattern, and this modality is noted here for completeness rather than as evidence of cross-modal convergence. In fNIRS, greater inferior frontal gyrus activation was found. In fMRI, effects clustered in medial prefrontal cortex (amygdala–PFC connectivity) and left inferior frontal gyrus (language network). In DTI, the arcuate fasciculus—projecting between inferior frontal and superior temporal cortex—was the most consistently implicated tract. In structural MRI, effects included frontal, parietal, and temporal surface area. Together, these findings converge on a fronto-temporal network encompassing language-processing regions (Broca's area, Wernicke's area, arcuate fasciculus) and executive/affective regulation regions (anterior cingulate, medial prefrontal cortex).</w:t>
       </w:r>
     </w:p>
     <w:p>
@@ -9028,7 +9028,7 @@
           <w:i w:val="0"/>
           <w:sz w:val="24"/>
         </w:rPr>
-        <w:t>This systematic review provides the most comprehensive cross-modal synthesis to date of evidence linking parental education to neural development in early childhood. The evidence base—spanning EEG, ERP, fNIRS, fMRI, DTI, and structural MRI across the neonatal to school-age period—converges on a single conclusion: higher parental education is broadly associated with more advanced neural development, with associations detectable from birth and persisting through middle childhood. The neural systems most consistently implicated—prefrontal cortex, temporal language regions, and the arcuate fasciculus—are the substrates of language acquisition and executive function, the behavioral domains most strongly predicted by parental education in the behavioral literature.</w:t>
+        <w:t>This systematic review provides the most comprehensive cross-modal synthesis to date of evidence linking parental education to neural development in early childhood. The evidence base—spanning EEG, ERP, fNIRS, fMRI, DTI, and structural MRI across the neonatal to school-age period—converges on a single conclusion: higher parental education is broadly associated with more advanced neural development, with associations emerging as early as the neonatal period and persisting through middle childhood. The neural systems most consistently implicated—prefrontal cortex, temporal language regions, and the arcuate fasciculus—are the substrates of language acquisition and executive function, the behavioral domains most strongly predicted by parental education in the behavioral literature.</w:t>
       </w:r>
     </w:p>
     <w:p>
@@ -9192,7 +9192,7 @@
           <w:i w:val="0"/>
           <w:sz w:val="24"/>
         </w:rPr>
-        <w:t xml:space="preserve">Button, K. S., Ioannidis, J. P. A., Mokrysz, C., Nosek, B. A., Flint, J., Robinson, E. S. J., &amp; Munafò, M. R. (2013). Power failure: Why small sample size undermines the reliability of neuroscience. </w:t>
+        <w:t xml:space="preserve">Blair, C., &amp; Raver, C. C. (2016). Poverty, stress, and brain development: New directions for prevention and intervention. </w:t>
       </w:r>
       <w:r>
         <w:rPr>
@@ -9201,7 +9201,7 @@
           <w:i/>
           <w:sz w:val="24"/>
         </w:rPr>
-        <w:t>Nature Reviews Neuroscience</w:t>
+        <w:t>Academic Pediatrics</w:t>
       </w:r>
       <w:r>
         <w:rPr>
@@ -9219,16 +9219,16 @@
           <w:i/>
           <w:sz w:val="24"/>
         </w:rPr>
-        <w:t>14</w:t>
-      </w:r>
-      <w:r>
-        <w:rPr>
-          <w:rFonts w:ascii="Times New Roman" w:hAnsi="Times New Roman"/>
-          <w:b w:val="0"/>
-          <w:i w:val="0"/>
-          <w:sz w:val="24"/>
-        </w:rPr>
-        <w:t>(5), 365–376. https://doi.org/10.1038/nrn3475</w:t>
+        <w:t>16</w:t>
+      </w:r>
+      <w:r>
+        <w:rPr>
+          <w:rFonts w:ascii="Times New Roman" w:hAnsi="Times New Roman"/>
+          <w:b w:val="0"/>
+          <w:i w:val="0"/>
+          <w:sz w:val="24"/>
+        </w:rPr>
+        <w:t>(3 Suppl), S30–S36. https://doi.org/10.1016/j.acap.2016.01.010</w:t>
       </w:r>
     </w:p>
     <w:p>
@@ -9243,7 +9243,7 @@
           <w:i w:val="0"/>
           <w:sz w:val="24"/>
         </w:rPr>
-        <w:t xml:space="preserve">Catani, M., &amp; Mesulam, M. (2008). The arcuate fasciculus and the disconnection theme in language and aphasia: History and current state. </w:t>
+        <w:t xml:space="preserve">Bradley, R. H., &amp; Corwyn, R. F. (2002). Socioeconomic status and child development. </w:t>
       </w:r>
       <w:r>
         <w:rPr>
@@ -9252,7 +9252,7 @@
           <w:i/>
           <w:sz w:val="24"/>
         </w:rPr>
-        <w:t>Cortex</w:t>
+        <w:t>Annual Review of Psychology</w:t>
       </w:r>
       <w:r>
         <w:rPr>
@@ -9270,16 +9270,16 @@
           <w:i/>
           <w:sz w:val="24"/>
         </w:rPr>
-        <w:t>44</w:t>
-      </w:r>
-      <w:r>
-        <w:rPr>
-          <w:rFonts w:ascii="Times New Roman" w:hAnsi="Times New Roman"/>
-          <w:b w:val="0"/>
-          <w:i w:val="0"/>
-          <w:sz w:val="24"/>
-        </w:rPr>
-        <w:t>(8), 953–961. https://doi.org/10.1016/j.cortex.2008.04.002</w:t>
+        <w:t>53</w:t>
+      </w:r>
+      <w:r>
+        <w:rPr>
+          <w:rFonts w:ascii="Times New Roman" w:hAnsi="Times New Roman"/>
+          <w:b w:val="0"/>
+          <w:i w:val="0"/>
+          <w:sz w:val="24"/>
+        </w:rPr>
+        <w:t>, 371–399. https://doi.org/10.1146/annurev.psych.53.100901.135233</w:t>
       </w:r>
     </w:p>
     <w:p>
@@ -9294,7 +9294,7 @@
           <w:i w:val="0"/>
           <w:sz w:val="24"/>
         </w:rPr>
-        <w:t xml:space="preserve">Davis-Kean, P. E. (2005). The influence of parent education and family income on child achievement: The indirect role of parental expectations and the home environment. </w:t>
+        <w:t xml:space="preserve">Branigan, A. R., McCallum, K. J., &amp; Freese, J. (2013). Variation in the heritability of educational attainment: An international meta-analysis. </w:t>
       </w:r>
       <w:r>
         <w:rPr>
@@ -9303,7 +9303,7 @@
           <w:i/>
           <w:sz w:val="24"/>
         </w:rPr>
-        <w:t>Journal of Family Psychology</w:t>
+        <w:t>Social Forces</w:t>
       </w:r>
       <w:r>
         <w:rPr>
@@ -9321,16 +9321,16 @@
           <w:i/>
           <w:sz w:val="24"/>
         </w:rPr>
-        <w:t>19</w:t>
-      </w:r>
-      <w:r>
-        <w:rPr>
-          <w:rFonts w:ascii="Times New Roman" w:hAnsi="Times New Roman"/>
-          <w:b w:val="0"/>
-          <w:i w:val="0"/>
-          <w:sz w:val="24"/>
-        </w:rPr>
-        <w:t>(2), 294–304. https://doi.org/10.1037/0893-3200.19.2.294</w:t>
+        <w:t>92</w:t>
+      </w:r>
+      <w:r>
+        <w:rPr>
+          <w:rFonts w:ascii="Times New Roman" w:hAnsi="Times New Roman"/>
+          <w:b w:val="0"/>
+          <w:i w:val="0"/>
+          <w:sz w:val="24"/>
+        </w:rPr>
+        <w:t>(1), 109–140. https://doi.org/10.1093/sf/sot076</w:t>
       </w:r>
     </w:p>
     <w:p>
@@ -9345,7 +9345,7 @@
           <w:i w:val="0"/>
           <w:sz w:val="24"/>
         </w:rPr>
-        <w:t xml:space="preserve">Davies, P. L., Segalowitz, S. J., &amp; Gavin, W. J. (2004). Development of response-monitoring ERPs in 7- to 25-year-olds. </w:t>
+        <w:t xml:space="preserve">Brito, N. H., Troller-Renfree, S. V., Leon-Santos, A., Isler, J. R., Fifer, W. P., &amp; Noble, K. G. (2020). Associations among the home language environment and neural activity during infancy. </w:t>
       </w:r>
       <w:r>
         <w:rPr>
@@ -9354,7 +9354,7 @@
           <w:i/>
           <w:sz w:val="24"/>
         </w:rPr>
-        <w:t>Developmental Neuropsychology</w:t>
+        <w:t>Developmental Cognitive Neuroscience</w:t>
       </w:r>
       <w:r>
         <w:rPr>
@@ -9372,16 +9372,16 @@
           <w:i/>
           <w:sz w:val="24"/>
         </w:rPr>
-        <w:t>25</w:t>
-      </w:r>
-      <w:r>
-        <w:rPr>
-          <w:rFonts w:ascii="Times New Roman" w:hAnsi="Times New Roman"/>
-          <w:b w:val="0"/>
-          <w:i w:val="0"/>
-          <w:sz w:val="24"/>
-        </w:rPr>
-        <w:t>(3), 355–376. https://doi.org/10.1207/s15326942dn2503_6</w:t>
+        <w:t>43</w:t>
+      </w:r>
+      <w:r>
+        <w:rPr>
+          <w:rFonts w:ascii="Times New Roman" w:hAnsi="Times New Roman"/>
+          <w:b w:val="0"/>
+          <w:i w:val="0"/>
+          <w:sz w:val="24"/>
+        </w:rPr>
+        <w:t>, Article 100780. https://doi.org/10.1016/j.dcn.2020.100780</w:t>
       </w:r>
     </w:p>
     <w:p>
@@ -9396,7 +9396,7 @@
           <w:i w:val="0"/>
           <w:sz w:val="24"/>
         </w:rPr>
-        <w:t xml:space="preserve">Diamond, A. (2013). Executive functions. </w:t>
+        <w:t xml:space="preserve">Button, K. S., Ioannidis, J. P. A., Mokrysz, C., Nosek, B. A., Flint, J., Robinson, E. S. J., &amp; Munafò, M. R. (2013). Power failure: Why small sample size undermines the reliability of neuroscience. </w:t>
       </w:r>
       <w:r>
         <w:rPr>
@@ -9405,7 +9405,7 @@
           <w:i/>
           <w:sz w:val="24"/>
         </w:rPr>
-        <w:t>Annual Review of Psychology</w:t>
+        <w:t>Nature Reviews Neuroscience</w:t>
       </w:r>
       <w:r>
         <w:rPr>
@@ -9423,16 +9423,16 @@
           <w:i/>
           <w:sz w:val="24"/>
         </w:rPr>
-        <w:t>64</w:t>
-      </w:r>
-      <w:r>
-        <w:rPr>
-          <w:rFonts w:ascii="Times New Roman" w:hAnsi="Times New Roman"/>
-          <w:b w:val="0"/>
-          <w:i w:val="0"/>
-          <w:sz w:val="24"/>
-        </w:rPr>
-        <w:t>, 135–168. https://doi.org/10.1146/annurev-psych-113011-143750</w:t>
+        <w:t>14</w:t>
+      </w:r>
+      <w:r>
+        <w:rPr>
+          <w:rFonts w:ascii="Times New Roman" w:hAnsi="Times New Roman"/>
+          <w:b w:val="0"/>
+          <w:i w:val="0"/>
+          <w:sz w:val="24"/>
+        </w:rPr>
+        <w:t>(5), 365–376. https://doi.org/10.1038/nrn3475</w:t>
       </w:r>
     </w:p>
     <w:p>
@@ -9447,7 +9447,7 @@
           <w:i w:val="0"/>
           <w:sz w:val="24"/>
         </w:rPr>
-        <w:t xml:space="preserve">Bradley, R. H., &amp; Corwyn, R. F. (2002). Socioeconomic status and child development. </w:t>
+        <w:t xml:space="preserve">Campbell, M., McKenzie, J. E., Sowden, A., Katikireddi, S. V., Brennan, S. E., Ellis, S., Hartmann-Boyce, J., Ryan, R., Shepperd, S., Thomas, J., Welch, V., &amp; Thomson, H. (2020). Synthesis without meta-analysis (SWiM) in systematic reviews: Reporting guideline. </w:t>
       </w:r>
       <w:r>
         <w:rPr>
@@ -9456,7 +9456,7 @@
           <w:i/>
           <w:sz w:val="24"/>
         </w:rPr>
-        <w:t>Annual Review of Psychology</w:t>
+        <w:t>BMJ</w:t>
       </w:r>
       <w:r>
         <w:rPr>
@@ -9474,16 +9474,16 @@
           <w:i/>
           <w:sz w:val="24"/>
         </w:rPr>
-        <w:t>53</w:t>
-      </w:r>
-      <w:r>
-        <w:rPr>
-          <w:rFonts w:ascii="Times New Roman" w:hAnsi="Times New Roman"/>
-          <w:b w:val="0"/>
-          <w:i w:val="0"/>
-          <w:sz w:val="24"/>
-        </w:rPr>
-        <w:t>, 371–399. https://doi.org/10.1146/annurev.psych.53.100901.135233</w:t>
+        <w:t>368</w:t>
+      </w:r>
+      <w:r>
+        <w:rPr>
+          <w:rFonts w:ascii="Times New Roman" w:hAnsi="Times New Roman"/>
+          <w:b w:val="0"/>
+          <w:i w:val="0"/>
+          <w:sz w:val="24"/>
+        </w:rPr>
+        <w:t>, l6890. https://doi.org/10.1136/bmj.l6890</w:t>
       </w:r>
     </w:p>
     <w:p>
@@ -9498,7 +9498,7 @@
           <w:i w:val="0"/>
           <w:sz w:val="24"/>
         </w:rPr>
-        <w:t xml:space="preserve">Brito, N. H., Troller-Renfree, S. V., Leon-Santos, A., Isler, J. R., Fifer, W. P., &amp; Noble, K. G. (2020). Associations among the home language environment and neural activity during infancy. </w:t>
+        <w:t xml:space="preserve">Catani, M., &amp; Mesulam, M. (2008). The arcuate fasciculus and the disconnection theme in language and aphasia: History and current state. </w:t>
       </w:r>
       <w:r>
         <w:rPr>
@@ -9507,7 +9507,7 @@
           <w:i/>
           <w:sz w:val="24"/>
         </w:rPr>
-        <w:t>Developmental Cognitive Neuroscience</w:t>
+        <w:t>Cortex</w:t>
       </w:r>
       <w:r>
         <w:rPr>
@@ -9525,16 +9525,16 @@
           <w:i/>
           <w:sz w:val="24"/>
         </w:rPr>
-        <w:t>43</w:t>
-      </w:r>
-      <w:r>
-        <w:rPr>
-          <w:rFonts w:ascii="Times New Roman" w:hAnsi="Times New Roman"/>
-          <w:b w:val="0"/>
-          <w:i w:val="0"/>
-          <w:sz w:val="24"/>
-        </w:rPr>
-        <w:t>, Article 100780. https://doi.org/10.1016/j.dcn.2020.100780</w:t>
+        <w:t>44</w:t>
+      </w:r>
+      <w:r>
+        <w:rPr>
+          <w:rFonts w:ascii="Times New Roman" w:hAnsi="Times New Roman"/>
+          <w:b w:val="0"/>
+          <w:i w:val="0"/>
+          <w:sz w:val="24"/>
+        </w:rPr>
+        <w:t>(8), 953–961. https://doi.org/10.1016/j.cortex.2008.04.002</w:t>
       </w:r>
     </w:p>
     <w:p>
@@ -9549,7 +9549,7 @@
           <w:i w:val="0"/>
           <w:sz w:val="24"/>
         </w:rPr>
-        <w:t xml:space="preserve">Campbell, M., McKenzie, J. E., Sowden, A., Katikireddi, S. V., Brennan, S. E., Ellis, S., Hartmann-Boyce, J., Ryan, R., Shepperd, S., Thomas, J., Welch, V., &amp; Thomson, H. (2020). Synthesis without meta-analysis (SWiM) in systematic reviews: Reporting guideline. </w:t>
+        <w:t xml:space="preserve">Conejero, Á., Guerra, S., Abundis-Gutiérrez, A., &amp; Rueda, M. R. (2018). Frontal theta activation associated with error monitoring in toddlers: influence of parental education. </w:t>
       </w:r>
       <w:r>
         <w:rPr>
@@ -9558,7 +9558,7 @@
           <w:i/>
           <w:sz w:val="24"/>
         </w:rPr>
-        <w:t>BMJ</w:t>
+        <w:t>Developmental Science</w:t>
       </w:r>
       <w:r>
         <w:rPr>
@@ -9576,16 +9576,16 @@
           <w:i/>
           <w:sz w:val="24"/>
         </w:rPr>
-        <w:t>368</w:t>
-      </w:r>
-      <w:r>
-        <w:rPr>
-          <w:rFonts w:ascii="Times New Roman" w:hAnsi="Times New Roman"/>
-          <w:b w:val="0"/>
-          <w:i w:val="0"/>
-          <w:sz w:val="24"/>
-        </w:rPr>
-        <w:t>, l6890. https://doi.org/10.1136/bmj.l6890</w:t>
+        <w:t>21</w:t>
+      </w:r>
+      <w:r>
+        <w:rPr>
+          <w:rFonts w:ascii="Times New Roman" w:hAnsi="Times New Roman"/>
+          <w:b w:val="0"/>
+          <w:i w:val="0"/>
+          <w:sz w:val="24"/>
+        </w:rPr>
+        <w:t>(3), e12570. https://doi.org/10.1111/desc.12570</w:t>
       </w:r>
     </w:p>
     <w:p>
@@ -9600,7 +9600,7 @@
           <w:i w:val="0"/>
           <w:sz w:val="24"/>
         </w:rPr>
-        <w:t xml:space="preserve">Conejero, Á., Guerra, S., Abundis-Gutiérrez, A., &amp; Rueda, M. R. (2018). Frontal theta activation associated with error monitoring in toddlers: influence of parental education. </w:t>
+        <w:t xml:space="preserve">Davies, P. L., Segalowitz, S. J., &amp; Gavin, W. J. (2004). Development of response-monitoring ERPs in 7- to 25-year-olds. </w:t>
       </w:r>
       <w:r>
         <w:rPr>
@@ -9609,7 +9609,7 @@
           <w:i/>
           <w:sz w:val="24"/>
         </w:rPr>
-        <w:t>Developmental Science</w:t>
+        <w:t>Developmental Neuropsychology</w:t>
       </w:r>
       <w:r>
         <w:rPr>
@@ -9627,16 +9627,16 @@
           <w:i/>
           <w:sz w:val="24"/>
         </w:rPr>
-        <w:t>21</w:t>
-      </w:r>
-      <w:r>
-        <w:rPr>
-          <w:rFonts w:ascii="Times New Roman" w:hAnsi="Times New Roman"/>
-          <w:b w:val="0"/>
-          <w:i w:val="0"/>
-          <w:sz w:val="24"/>
-        </w:rPr>
-        <w:t>(3), e12570. https://doi.org/10.1111/desc.12570</w:t>
+        <w:t>25</w:t>
+      </w:r>
+      <w:r>
+        <w:rPr>
+          <w:rFonts w:ascii="Times New Roman" w:hAnsi="Times New Roman"/>
+          <w:b w:val="0"/>
+          <w:i w:val="0"/>
+          <w:sz w:val="24"/>
+        </w:rPr>
+        <w:t>(3), 355–376. https://doi.org/10.1207/s15326942dn2503_6</w:t>
       </w:r>
     </w:p>
     <w:p>
@@ -9651,7 +9651,7 @@
           <w:i w:val="0"/>
           <w:sz w:val="24"/>
         </w:rPr>
-        <w:t xml:space="preserve">Duncan, G. J., &amp; Magnuson, K. (2012). Socioeconomic status and cognitive functioning: Moving from correlation to causation. </w:t>
+        <w:t xml:space="preserve">Davis-Kean, P. E. (2005). The influence of parent education and family income on child achievement: The indirect role of parental expectations and the home environment. </w:t>
       </w:r>
       <w:r>
         <w:rPr>
@@ -9660,7 +9660,7 @@
           <w:i/>
           <w:sz w:val="24"/>
         </w:rPr>
-        <w:t>WIREs Cognitive Science</w:t>
+        <w:t>Journal of Family Psychology</w:t>
       </w:r>
       <w:r>
         <w:rPr>
@@ -9678,16 +9678,16 @@
           <w:i/>
           <w:sz w:val="24"/>
         </w:rPr>
-        <w:t>3</w:t>
-      </w:r>
-      <w:r>
-        <w:rPr>
-          <w:rFonts w:ascii="Times New Roman" w:hAnsi="Times New Roman"/>
-          <w:b w:val="0"/>
-          <w:i w:val="0"/>
-          <w:sz w:val="24"/>
-        </w:rPr>
-        <w:t>(4), 377–386. https://doi.org/10.1002/wcs.1185</w:t>
+        <w:t>19</w:t>
+      </w:r>
+      <w:r>
+        <w:rPr>
+          <w:rFonts w:ascii="Times New Roman" w:hAnsi="Times New Roman"/>
+          <w:b w:val="0"/>
+          <w:i w:val="0"/>
+          <w:sz w:val="24"/>
+        </w:rPr>
+        <w:t>(2), 294–304. https://doi.org/10.1037/0893-3200.19.2.294</w:t>
       </w:r>
     </w:p>
     <w:p>
@@ -9702,7 +9702,7 @@
           <w:i w:val="0"/>
           <w:sz w:val="24"/>
         </w:rPr>
-        <w:t xml:space="preserve">Branigan, A. R., McCallum, K. J., &amp; Freese, J. (2013). Variation in the heritability of educational attainment: An international meta-analysis. </w:t>
+        <w:t xml:space="preserve">Demir-Lira, Ö. E., Prado, J., &amp; Booth, J. R. (2021). Neurocognitive basis of deductive reasoning in children varies with parental education. </w:t>
       </w:r>
       <w:r>
         <w:rPr>
@@ -9711,7 +9711,7 @@
           <w:i/>
           <w:sz w:val="24"/>
         </w:rPr>
-        <w:t>Social Forces</w:t>
+        <w:t>Human Brain Mapping</w:t>
       </w:r>
       <w:r>
         <w:rPr>
@@ -9729,16 +9729,16 @@
           <w:i/>
           <w:sz w:val="24"/>
         </w:rPr>
-        <w:t>92</w:t>
-      </w:r>
-      <w:r>
-        <w:rPr>
-          <w:rFonts w:ascii="Times New Roman" w:hAnsi="Times New Roman"/>
-          <w:b w:val="0"/>
-          <w:i w:val="0"/>
-          <w:sz w:val="24"/>
-        </w:rPr>
-        <w:t>(1), 109–140. https://doi.org/10.1093/sf/sot076</w:t>
+        <w:t>42</w:t>
+      </w:r>
+      <w:r>
+        <w:rPr>
+          <w:rFonts w:ascii="Times New Roman" w:hAnsi="Times New Roman"/>
+          <w:b w:val="0"/>
+          <w:i w:val="0"/>
+          <w:sz w:val="24"/>
+        </w:rPr>
+        <w:t>(11), 3396–3410. https://doi.org/10.1002/hbm.25441</w:t>
       </w:r>
     </w:p>
     <w:p>
@@ -9753,7 +9753,7 @@
           <w:i w:val="0"/>
           <w:sz w:val="24"/>
         </w:rPr>
-        <w:t xml:space="preserve">Gee, D. G., Gabard-Durnam, L. J., Flannery, J., Goff, B., Humphreys, K. L., Telzer, E. H., Hare, T. A., Bookheimer, S. Y., &amp; Tottenham, N. (2013). Early developmental emergence of human amygdala–prefrontal connectivity after maternal deprivation. </w:t>
+        <w:t xml:space="preserve">Diamond, A. (2013). Executive functions. </w:t>
       </w:r>
       <w:r>
         <w:rPr>
@@ -9762,7 +9762,7 @@
           <w:i/>
           <w:sz w:val="24"/>
         </w:rPr>
-        <w:t>Proceedings of the National Academy of Sciences</w:t>
+        <w:t>Annual Review of Psychology</w:t>
       </w:r>
       <w:r>
         <w:rPr>
@@ -9780,16 +9780,16 @@
           <w:i/>
           <w:sz w:val="24"/>
         </w:rPr>
-        <w:t>110</w:t>
-      </w:r>
-      <w:r>
-        <w:rPr>
-          <w:rFonts w:ascii="Times New Roman" w:hAnsi="Times New Roman"/>
-          <w:b w:val="0"/>
-          <w:i w:val="0"/>
-          <w:sz w:val="24"/>
-        </w:rPr>
-        <w:t>(39), 15638–15643. https://doi.org/10.1073/pnas.1307893110</w:t>
+        <w:t>64</w:t>
+      </w:r>
+      <w:r>
+        <w:rPr>
+          <w:rFonts w:ascii="Times New Roman" w:hAnsi="Times New Roman"/>
+          <w:b w:val="0"/>
+          <w:i w:val="0"/>
+          <w:sz w:val="24"/>
+        </w:rPr>
+        <w:t>, 135–168. https://doi.org/10.1146/annurev-psych-113011-143750</w:t>
       </w:r>
     </w:p>
     <w:p>
@@ -9804,7 +9804,7 @@
           <w:i w:val="0"/>
           <w:sz w:val="24"/>
         </w:rPr>
-        <w:t xml:space="preserve">Hackman, D. A., &amp; Farah, M. J. (2009). Socioeconomic status and the developing brain. </w:t>
+        <w:t xml:space="preserve">Duncan, G. J., &amp; Magnuson, K. (2012). Socioeconomic status and cognitive functioning: Moving from correlation to causation. </w:t>
       </w:r>
       <w:r>
         <w:rPr>
@@ -9813,7 +9813,7 @@
           <w:i/>
           <w:sz w:val="24"/>
         </w:rPr>
-        <w:t>Trends in Cognitive Sciences</w:t>
+        <w:t>WIREs Cognitive Science</w:t>
       </w:r>
       <w:r>
         <w:rPr>
@@ -9831,16 +9831,16 @@
           <w:i/>
           <w:sz w:val="24"/>
         </w:rPr>
-        <w:t>13</w:t>
-      </w:r>
-      <w:r>
-        <w:rPr>
-          <w:rFonts w:ascii="Times New Roman" w:hAnsi="Times New Roman"/>
-          <w:b w:val="0"/>
-          <w:i w:val="0"/>
-          <w:sz w:val="24"/>
-        </w:rPr>
-        <w:t>(2), 65–73. https://doi.org/10.1016/j.tics.2008.11.003</w:t>
+        <w:t>3</w:t>
+      </w:r>
+      <w:r>
+        <w:rPr>
+          <w:rFonts w:ascii="Times New Roman" w:hAnsi="Times New Roman"/>
+          <w:b w:val="0"/>
+          <w:i w:val="0"/>
+          <w:sz w:val="24"/>
+        </w:rPr>
+        <w:t>(4), 377–386. https://doi.org/10.1002/wcs.1185</w:t>
       </w:r>
     </w:p>
     <w:p>
@@ -9855,7 +9855,7 @@
           <w:i w:val="0"/>
           <w:sz w:val="24"/>
         </w:rPr>
-        <w:t xml:space="preserve">Hackman, D. A., Farah, M. J., &amp; Meaney, M. J. (2010). Socioeconomic status and the brain: Mechanistic insights from human and animal research. </w:t>
+        <w:t xml:space="preserve">Friederici, A. D. (2012). Language development and the ontogeny of the dorsal pathway. </w:t>
       </w:r>
       <w:r>
         <w:rPr>
@@ -9864,7 +9864,7 @@
           <w:i/>
           <w:sz w:val="24"/>
         </w:rPr>
-        <w:t>Nature Reviews Neuroscience</w:t>
+        <w:t>Frontiers in Evolutionary Neuroscience</w:t>
       </w:r>
       <w:r>
         <w:rPr>
@@ -9882,16 +9882,16 @@
           <w:i/>
           <w:sz w:val="24"/>
         </w:rPr>
-        <w:t>11</w:t>
-      </w:r>
-      <w:r>
-        <w:rPr>
-          <w:rFonts w:ascii="Times New Roman" w:hAnsi="Times New Roman"/>
-          <w:b w:val="0"/>
-          <w:i w:val="0"/>
-          <w:sz w:val="24"/>
-        </w:rPr>
-        <w:t>(9), 651–659. https://doi.org/10.1038/nrn2844</w:t>
+        <w:t>4</w:t>
+      </w:r>
+      <w:r>
+        <w:rPr>
+          <w:rFonts w:ascii="Times New Roman" w:hAnsi="Times New Roman"/>
+          <w:b w:val="0"/>
+          <w:i w:val="0"/>
+          <w:sz w:val="24"/>
+        </w:rPr>
+        <w:t>, Article 3. https://doi.org/10.3389/fnevo.2012.00003</w:t>
       </w:r>
     </w:p>
     <w:p>
@@ -9906,7 +9906,7 @@
           <w:i w:val="0"/>
           <w:sz w:val="24"/>
         </w:rPr>
-        <w:t xml:space="preserve">Hoff, E. (2013). Interpreting the early language trajectories of children from low-SES and language minority homes: Implications for closing achievement gaps. </w:t>
+        <w:t xml:space="preserve">Friederici, A. D. (2016). The ontogeny of the cortical language network. </w:t>
       </w:r>
       <w:r>
         <w:rPr>
@@ -9915,7 +9915,7 @@
           <w:i/>
           <w:sz w:val="24"/>
         </w:rPr>
-        <w:t>Developmental Psychology</w:t>
+        <w:t>Nature Reviews Neuroscience</w:t>
       </w:r>
       <w:r>
         <w:rPr>
@@ -9933,16 +9933,16 @@
           <w:i/>
           <w:sz w:val="24"/>
         </w:rPr>
-        <w:t>49</w:t>
-      </w:r>
-      <w:r>
-        <w:rPr>
-          <w:rFonts w:ascii="Times New Roman" w:hAnsi="Times New Roman"/>
-          <w:b w:val="0"/>
-          <w:i w:val="0"/>
-          <w:sz w:val="24"/>
-        </w:rPr>
-        <w:t>(1), 4–14. https://doi.org/10.1037/a0030612</w:t>
+        <w:t>17</w:t>
+      </w:r>
+      <w:r>
+        <w:rPr>
+          <w:rFonts w:ascii="Times New Roman" w:hAnsi="Times New Roman"/>
+          <w:b w:val="0"/>
+          <w:i w:val="0"/>
+          <w:sz w:val="24"/>
+        </w:rPr>
+        <w:t>(5), 323–332. https://doi.org/10.1038/nrn.2016.23</w:t>
       </w:r>
     </w:p>
     <w:p>
@@ -9957,7 +9957,7 @@
           <w:i w:val="0"/>
           <w:sz w:val="24"/>
         </w:rPr>
-        <w:t xml:space="preserve">Knickmeyer, R. C., Gouttard, S., Kang, C., Evans, D., Wilber, K., Smith, J. K., Hamer, R. M., Lin, W., Gerig, G., &amp; Gilmore, J. H. (2008). A structural MRI study of human brain development from birth to 2 years. </w:t>
+        <w:t xml:space="preserve">Gee, D. G., Gabard-Durnam, L. J., Flannery, J., Goff, B., Humphreys, K. L., Telzer, E. H., Hare, T. A., Bookheimer, S. Y., &amp; Tottenham, N. (2013). Early developmental emergence of human amygdala–prefrontal connectivity after maternal deprivation. </w:t>
       </w:r>
       <w:r>
         <w:rPr>
@@ -9966,7 +9966,7 @@
           <w:i/>
           <w:sz w:val="24"/>
         </w:rPr>
-        <w:t>Journal of Neuroscience</w:t>
+        <w:t>Proceedings of the National Academy of Sciences</w:t>
       </w:r>
       <w:r>
         <w:rPr>
@@ -9984,16 +9984,16 @@
           <w:i/>
           <w:sz w:val="24"/>
         </w:rPr>
-        <w:t>28</w:t>
-      </w:r>
-      <w:r>
-        <w:rPr>
-          <w:rFonts w:ascii="Times New Roman" w:hAnsi="Times New Roman"/>
-          <w:b w:val="0"/>
-          <w:i w:val="0"/>
-          <w:sz w:val="24"/>
-        </w:rPr>
-        <w:t>(47), 12176–12182. https://doi.org/10.1523/JNEUROSCI.3479-08.2008</w:t>
+        <w:t>110</w:t>
+      </w:r>
+      <w:r>
+        <w:rPr>
+          <w:rFonts w:ascii="Times New Roman" w:hAnsi="Times New Roman"/>
+          <w:b w:val="0"/>
+          <w:i w:val="0"/>
+          <w:sz w:val="24"/>
+        </w:rPr>
+        <w:t>(39), 15638–15643. https://doi.org/10.1073/pnas.1307893110</w:t>
       </w:r>
     </w:p>
     <w:p>
@@ -10008,7 +10008,7 @@
           <w:i w:val="0"/>
           <w:sz w:val="24"/>
         </w:rPr>
-        <w:t xml:space="preserve">Lange, N., Froimowitz, M. P., Bigler, E. D., &amp; Lainhart, J. E. (2010). Associations between IQ, total and regional brain volumes, and demography in a large normative sample of healthy children and adolescents. </w:t>
+        <w:t xml:space="preserve">Gilkerson, J., Richards, J. A., Warren, S. F., Montgomery, J. K., Greenwood, C. R., Kimbrough Oller, D., Hansen, J. H. L., &amp; Paul, T. D. (2017). Mapping the early language environment using all-day recordings and automated analysis. </w:t>
       </w:r>
       <w:r>
         <w:rPr>
@@ -10017,7 +10017,7 @@
           <w:i/>
           <w:sz w:val="24"/>
         </w:rPr>
-        <w:t>Developmental Neuropsychology</w:t>
+        <w:t>American Journal of Speech-Language Pathology</w:t>
       </w:r>
       <w:r>
         <w:rPr>
@@ -10035,16 +10035,16 @@
           <w:i/>
           <w:sz w:val="24"/>
         </w:rPr>
-        <w:t>35</w:t>
-      </w:r>
-      <w:r>
-        <w:rPr>
-          <w:rFonts w:ascii="Times New Roman" w:hAnsi="Times New Roman"/>
-          <w:b w:val="0"/>
-          <w:i w:val="0"/>
-          <w:sz w:val="24"/>
-        </w:rPr>
-        <w:t>(3), 296–317. https://doi.org/10.1080/87565641003696833</w:t>
+        <w:t>26</w:t>
+      </w:r>
+      <w:r>
+        <w:rPr>
+          <w:rFonts w:ascii="Times New Roman" w:hAnsi="Times New Roman"/>
+          <w:b w:val="0"/>
+          <w:i w:val="0"/>
+          <w:sz w:val="24"/>
+        </w:rPr>
+        <w:t>(2), 248–265. https://doi.org/10.1044/2016_AJSLP-15-0169</w:t>
       </w:r>
     </w:p>
     <w:p>
@@ -10059,7 +10059,7 @@
           <w:i w:val="0"/>
           <w:sz w:val="24"/>
         </w:rPr>
-        <w:t xml:space="preserve">Maguire, M. J., &amp; Schneider, J. M. (2019). Socioeconomic status related differences in resting state EEG activity correspond to differences in vocabulary and working memory in grade school. </w:t>
+        <w:t xml:space="preserve">Hackman, D. A., &amp; Farah, M. J. (2009). Socioeconomic status and the developing brain. </w:t>
       </w:r>
       <w:r>
         <w:rPr>
@@ -10068,7 +10068,7 @@
           <w:i/>
           <w:sz w:val="24"/>
         </w:rPr>
-        <w:t>Brain and Cognition</w:t>
+        <w:t>Trends in Cognitive Sciences</w:t>
       </w:r>
       <w:r>
         <w:rPr>
@@ -10086,16 +10086,16 @@
           <w:i/>
           <w:sz w:val="24"/>
         </w:rPr>
-        <w:t>137</w:t>
-      </w:r>
-      <w:r>
-        <w:rPr>
-          <w:rFonts w:ascii="Times New Roman" w:hAnsi="Times New Roman"/>
-          <w:b w:val="0"/>
-          <w:i w:val="0"/>
-          <w:sz w:val="24"/>
-        </w:rPr>
-        <w:t>, Article 103619. https://doi.org/10.1016/j.bandc.2019.103619</w:t>
+        <w:t>13</w:t>
+      </w:r>
+      <w:r>
+        <w:rPr>
+          <w:rFonts w:ascii="Times New Roman" w:hAnsi="Times New Roman"/>
+          <w:b w:val="0"/>
+          <w:i w:val="0"/>
+          <w:sz w:val="24"/>
+        </w:rPr>
+        <w:t>(2), 65–73. https://doi.org/10.1016/j.tics.2008.11.003</w:t>
       </w:r>
     </w:p>
     <w:p>
@@ -10110,7 +10110,7 @@
           <w:i w:val="0"/>
           <w:sz w:val="24"/>
         </w:rPr>
-        <w:t xml:space="preserve">McEwen, B. S., &amp; Gianaros, P. J. (2010). Central role of the brain in stress and adaptation: Links to socioeconomic status, health, and disease. </w:t>
+        <w:t xml:space="preserve">Hackman, D. A., Farah, M. J., &amp; Meaney, M. J. (2010). Socioeconomic status and the brain: Mechanistic insights from human and animal research. </w:t>
       </w:r>
       <w:r>
         <w:rPr>
@@ -10119,7 +10119,7 @@
           <w:i/>
           <w:sz w:val="24"/>
         </w:rPr>
-        <w:t>Annals of the New York Academy of Sciences</w:t>
+        <w:t>Nature Reviews Neuroscience</w:t>
       </w:r>
       <w:r>
         <w:rPr>
@@ -10137,16 +10137,16 @@
           <w:i/>
           <w:sz w:val="24"/>
         </w:rPr>
-        <w:t>1186</w:t>
-      </w:r>
-      <w:r>
-        <w:rPr>
-          <w:rFonts w:ascii="Times New Roman" w:hAnsi="Times New Roman"/>
-          <w:b w:val="0"/>
-          <w:i w:val="0"/>
-          <w:sz w:val="24"/>
-        </w:rPr>
-        <w:t>, 190–222. https://doi.org/10.1111/j.1749-6632.2009.05437.x</w:t>
+        <w:t>11</w:t>
+      </w:r>
+      <w:r>
+        <w:rPr>
+          <w:rFonts w:ascii="Times New Roman" w:hAnsi="Times New Roman"/>
+          <w:b w:val="0"/>
+          <w:i w:val="0"/>
+          <w:sz w:val="24"/>
+        </w:rPr>
+        <w:t>(9), 651–659. https://doi.org/10.1038/nrn2844</w:t>
       </w:r>
     </w:p>
     <w:p>
@@ -10161,7 +10161,7 @@
           <w:i w:val="0"/>
           <w:sz w:val="24"/>
         </w:rPr>
-        <w:t xml:space="preserve">McKinnon, K., Galdi, P., Blesa-Cábez, M., Sullivan, G., Vaher, K., Corrigan, A., Hall, J., Jiménez-Sánchez, L., Thrippleton, M., Bastin, M. E., Quigley, A. J., Valavani, E., Tsanas, A., Richardson, H., &amp; Boardman, J. P. (2023). Association of preterm birth and socioeconomic status with neonatal brain structure. </w:t>
+        <w:t xml:space="preserve">Hair, N. L., Hanson, J. L., Wolfe, B. L., &amp; Pollak, S. D. (2015). Association of child poverty, brain development, and academic achievement. </w:t>
       </w:r>
       <w:r>
         <w:rPr>
@@ -10188,16 +10188,16 @@
           <w:i/>
           <w:sz w:val="24"/>
         </w:rPr>
-        <w:t>177</w:t>
-      </w:r>
-      <w:r>
-        <w:rPr>
-          <w:rFonts w:ascii="Times New Roman" w:hAnsi="Times New Roman"/>
-          <w:b w:val="0"/>
-          <w:i w:val="0"/>
-          <w:sz w:val="24"/>
-        </w:rPr>
-        <w:t>(4), 380–389. https://doi.org/10.1001/jamapediatrics.2022.5847</w:t>
+        <w:t>169</w:t>
+      </w:r>
+      <w:r>
+        <w:rPr>
+          <w:rFonts w:ascii="Times New Roman" w:hAnsi="Times New Roman"/>
+          <w:b w:val="0"/>
+          <w:i w:val="0"/>
+          <w:sz w:val="24"/>
+        </w:rPr>
+        <w:t>(9), 822–829. https://doi.org/10.1001/jamapediatrics.2015.1475</w:t>
       </w:r>
     </w:p>
     <w:p>
@@ -10212,7 +10212,7 @@
           <w:i w:val="0"/>
           <w:sz w:val="24"/>
         </w:rPr>
-        <w:t xml:space="preserve">Noble, K. G., Houston, S. M., Brito, N. H., Bartsch, H., Kan, E., Kuperman, J. M., Akshoomoff, N., Amaral, D. G., Bloss, C. S., Libiger, O., Schork, N. J., Murray, S. S., Casey, B. J., Chang, L., Ernst, T. M., Frazier, J. A., Gruen, J. R., Kennedy, D. N., Van Zijl, P., … Sowell, E. R. (2015). Family income, parental education and brain structure in children and adolescents. </w:t>
+        <w:t xml:space="preserve">Hart, B., &amp; Risley, T. R. (1995). </w:t>
       </w:r>
       <w:r>
         <w:rPr>
@@ -10221,34 +10221,16 @@
           <w:i/>
           <w:sz w:val="24"/>
         </w:rPr>
-        <w:t>Nature Neuroscience</w:t>
-      </w:r>
-      <w:r>
-        <w:rPr>
-          <w:rFonts w:ascii="Times New Roman" w:hAnsi="Times New Roman"/>
-          <w:b w:val="0"/>
-          <w:i w:val="0"/>
-          <w:sz w:val="24"/>
-        </w:rPr>
-        <w:t xml:space="preserve">, </w:t>
-      </w:r>
-      <w:r>
-        <w:rPr>
-          <w:rFonts w:ascii="Times New Roman" w:hAnsi="Times New Roman"/>
-          <w:b w:val="0"/>
-          <w:i/>
-          <w:sz w:val="24"/>
-        </w:rPr>
-        <w:t>18</w:t>
-      </w:r>
-      <w:r>
-        <w:rPr>
-          <w:rFonts w:ascii="Times New Roman" w:hAnsi="Times New Roman"/>
-          <w:b w:val="0"/>
-          <w:i w:val="0"/>
-          <w:sz w:val="24"/>
-        </w:rPr>
-        <w:t>(5), 773–778. https://doi.org/10.1038/nn.3983</w:t>
+        <w:t>Meaningful differences in the everyday experience of young American children</w:t>
+      </w:r>
+      <w:r>
+        <w:rPr>
+          <w:rFonts w:ascii="Times New Roman" w:hAnsi="Times New Roman"/>
+          <w:b w:val="0"/>
+          <w:i w:val="0"/>
+          <w:sz w:val="24"/>
+        </w:rPr>
+        <w:t>. Paul H. Brookes.</w:t>
       </w:r>
     </w:p>
     <w:p>
@@ -10263,7 +10245,7 @@
           <w:i w:val="0"/>
           <w:sz w:val="24"/>
         </w:rPr>
-        <w:t xml:space="preserve">Page, M. J., McKenzie, J. E., Bossuyt, P. M., Boutron, I., Hoffmann, T. C., Mulrow, C. D., Shamseer, L., Tetzlaff, J. M., Akl, E. A., Brennan, S. E., Chou, R., Gluud, C., Mayo-Wilson, E., McDonald, S., McGuinness, L. A., Stewart, L. A., Thomas, J., Tricco, A. C., Welch, V. A., … Moher, D. (2021). The PRISMA 2020 statement: An updated guideline for reporting systematic reviews. </w:t>
+        <w:t xml:space="preserve">Hoff, E. (2003). The specificity of environmental influence: Socioeconomic status affects early vocabulary development via maternal speech. </w:t>
       </w:r>
       <w:r>
         <w:rPr>
@@ -10272,7 +10254,7 @@
           <w:i/>
           <w:sz w:val="24"/>
         </w:rPr>
-        <w:t>BMJ</w:t>
+        <w:t>Child Development</w:t>
       </w:r>
       <w:r>
         <w:rPr>
@@ -10290,16 +10272,16 @@
           <w:i/>
           <w:sz w:val="24"/>
         </w:rPr>
-        <w:t>372</w:t>
-      </w:r>
-      <w:r>
-        <w:rPr>
-          <w:rFonts w:ascii="Times New Roman" w:hAnsi="Times New Roman"/>
-          <w:b w:val="0"/>
-          <w:i w:val="0"/>
-          <w:sz w:val="24"/>
-        </w:rPr>
-        <w:t>, n71. https://doi.org/10.1136/bmj.n71</w:t>
+        <w:t>74</w:t>
+      </w:r>
+      <w:r>
+        <w:rPr>
+          <w:rFonts w:ascii="Times New Roman" w:hAnsi="Times New Roman"/>
+          <w:b w:val="0"/>
+          <w:i w:val="0"/>
+          <w:sz w:val="24"/>
+        </w:rPr>
+        <w:t>(5), 1368–1378. https://doi.org/10.1111/1467-8624.00612</w:t>
       </w:r>
     </w:p>
     <w:p>
@@ -10314,7 +10296,7 @@
           <w:i w:val="0"/>
           <w:sz w:val="24"/>
         </w:rPr>
-        <w:t xml:space="preserve">Shephard, E., Fatori, D., Mauro, L. R., de Medeiros Filho, M. V., Hoexter, M. Q., Chiesa, A. M., Fracolli, L. A., Brentani, H., Ferraro, A. A., Nelson, C. A., Miguel, E. C., &amp; Polanczyk, G. V. (2019). Effects of maternal psychopathology and education level on neurocognitive development in infants of adolescent mothers living in poverty. </w:t>
+        <w:t xml:space="preserve">Hoff, E. (2013). Interpreting the early language trajectories of children from low-SES and language minority homes: Implications for closing achievement gaps. </w:t>
       </w:r>
       <w:r>
         <w:rPr>
@@ -10323,7 +10305,7 @@
           <w:i/>
           <w:sz w:val="24"/>
         </w:rPr>
-        <w:t>Biological Psychiatry: Cognitive Neuroscience and Neuroimaging</w:t>
+        <w:t>Developmental Psychology</w:t>
       </w:r>
       <w:r>
         <w:rPr>
@@ -10341,16 +10323,16 @@
           <w:i/>
           <w:sz w:val="24"/>
         </w:rPr>
-        <w:t>4</w:t>
-      </w:r>
-      <w:r>
-        <w:rPr>
-          <w:rFonts w:ascii="Times New Roman" w:hAnsi="Times New Roman"/>
-          <w:b w:val="0"/>
-          <w:i w:val="0"/>
-          <w:sz w:val="24"/>
-        </w:rPr>
-        <w:t>(11), 1136–1145. https://doi.org/10.1016/j.bpsc.2019.05.009</w:t>
+        <w:t>49</w:t>
+      </w:r>
+      <w:r>
+        <w:rPr>
+          <w:rFonts w:ascii="Times New Roman" w:hAnsi="Times New Roman"/>
+          <w:b w:val="0"/>
+          <w:i w:val="0"/>
+          <w:sz w:val="24"/>
+        </w:rPr>
+        <w:t>(1), 4–14. https://doi.org/10.1037/a0030612</w:t>
       </w:r>
     </w:p>
     <w:p>
@@ -10365,7 +10347,7 @@
           <w:i w:val="0"/>
           <w:sz w:val="24"/>
         </w:rPr>
-        <w:t xml:space="preserve">Stiles, J., &amp; Jernigan, T. L. (2010). The basics of brain development. </w:t>
+        <w:t xml:space="preserve">Huttenlocher, P. R., &amp; Dabholkar, A. S. (1997). Regional differences in synaptogenesis in human cerebral cortex. </w:t>
       </w:r>
       <w:r>
         <w:rPr>
@@ -10374,7 +10356,7 @@
           <w:i/>
           <w:sz w:val="24"/>
         </w:rPr>
-        <w:t>Neuropsychology Review</w:t>
+        <w:t>Journal of Comparative Neurology</w:t>
       </w:r>
       <w:r>
         <w:rPr>
@@ -10392,16 +10374,16 @@
           <w:i/>
           <w:sz w:val="24"/>
         </w:rPr>
-        <w:t>20</w:t>
-      </w:r>
-      <w:r>
-        <w:rPr>
-          <w:rFonts w:ascii="Times New Roman" w:hAnsi="Times New Roman"/>
-          <w:b w:val="0"/>
-          <w:i w:val="0"/>
-          <w:sz w:val="24"/>
-        </w:rPr>
-        <w:t>(4), 327–348. https://doi.org/10.1007/s11065-010-9148-4</w:t>
+        <w:t>387</w:t>
+      </w:r>
+      <w:r>
+        <w:rPr>
+          <w:rFonts w:ascii="Times New Roman" w:hAnsi="Times New Roman"/>
+          <w:b w:val="0"/>
+          <w:i w:val="0"/>
+          <w:sz w:val="24"/>
+        </w:rPr>
+        <w:t>(2), 167–178. https://doi.org/10.1002/(SICI)1096-9861(19971020)387:2&lt;167::AID-CNE1&gt;3.0.CO;2-Z</w:t>
       </w:r>
     </w:p>
     <w:p>
@@ -10416,7 +10398,7 @@
           <w:i w:val="0"/>
           <w:sz w:val="24"/>
         </w:rPr>
-        <w:t xml:space="preserve">Tomalski, P., &amp; Johnson, M. H. (2010). The effects of early adversity on the adult and developing brain. </w:t>
+        <w:t xml:space="preserve">Knickmeyer, R. C., Gouttard, S., Kang, C., Evans, D., Wilber, K., Smith, J. K., Hamer, R. M., Lin, W., Gerig, G., &amp; Gilmore, J. H. (2008). A structural MRI study of human brain development from birth to 2 years. </w:t>
       </w:r>
       <w:r>
         <w:rPr>
@@ -10425,7 +10407,7 @@
           <w:i/>
           <w:sz w:val="24"/>
         </w:rPr>
-        <w:t>Current Opinion in Psychiatry</w:t>
+        <w:t>Journal of Neuroscience</w:t>
       </w:r>
       <w:r>
         <w:rPr>
@@ -10443,16 +10425,16 @@
           <w:i/>
           <w:sz w:val="24"/>
         </w:rPr>
-        <w:t>23</w:t>
-      </w:r>
-      <w:r>
-        <w:rPr>
-          <w:rFonts w:ascii="Times New Roman" w:hAnsi="Times New Roman"/>
-          <w:b w:val="0"/>
-          <w:i w:val="0"/>
-          <w:sz w:val="24"/>
-        </w:rPr>
-        <w:t>(3), 233–238. https://doi.org/10.1097/YCO.0b013e3283387d9f</w:t>
+        <w:t>28</w:t>
+      </w:r>
+      <w:r>
+        <w:rPr>
+          <w:rFonts w:ascii="Times New Roman" w:hAnsi="Times New Roman"/>
+          <w:b w:val="0"/>
+          <w:i w:val="0"/>
+          <w:sz w:val="24"/>
+        </w:rPr>
+        <w:t>(47), 12176–12182. https://doi.org/10.1523/JNEUROSCI.3479-08.2008</w:t>
       </w:r>
     </w:p>
     <w:p>
@@ -10467,7 +10449,7 @@
           <w:i w:val="0"/>
           <w:sz w:val="24"/>
         </w:rPr>
-        <w:t xml:space="preserve">Wells, G. A., Shea, B., O'Connell, D., Peterson, J., Welch, V., Losos, M., &amp; Tugwell, P. (2000). </w:t>
+        <w:t xml:space="preserve">Knudsen, E. I., Heckman, J. J., Cameron, J. L., &amp; Shonkoff, J. P. (2006). Economic, neurobiological, and behavioral perspectives on building America's future workforce. </w:t>
       </w:r>
       <w:r>
         <w:rPr>
@@ -10476,16 +10458,34 @@
           <w:i/>
           <w:sz w:val="24"/>
         </w:rPr>
-        <w:t>The Newcastle–Ottawa Scale (NOS) for assessing the quality of nonrandomised studies in meta-analyses</w:t>
-      </w:r>
-      <w:r>
-        <w:rPr>
-          <w:rFonts w:ascii="Times New Roman" w:hAnsi="Times New Roman"/>
-          <w:b w:val="0"/>
-          <w:i w:val="0"/>
-          <w:sz w:val="24"/>
-        </w:rPr>
-        <w:t>. Ottawa Hospital Research Institute. http://www.ohri.ca/programs/clinical_epidemiology/oxford.asp</w:t>
+        <w:t>Proceedings of the National Academy of Sciences</w:t>
+      </w:r>
+      <w:r>
+        <w:rPr>
+          <w:rFonts w:ascii="Times New Roman" w:hAnsi="Times New Roman"/>
+          <w:b w:val="0"/>
+          <w:i w:val="0"/>
+          <w:sz w:val="24"/>
+        </w:rPr>
+        <w:t xml:space="preserve">, </w:t>
+      </w:r>
+      <w:r>
+        <w:rPr>
+          <w:rFonts w:ascii="Times New Roman" w:hAnsi="Times New Roman"/>
+          <w:b w:val="0"/>
+          <w:i/>
+          <w:sz w:val="24"/>
+        </w:rPr>
+        <w:t>103</w:t>
+      </w:r>
+      <w:r>
+        <w:rPr>
+          <w:rFonts w:ascii="Times New Roman" w:hAnsi="Times New Roman"/>
+          <w:b w:val="0"/>
+          <w:i w:val="0"/>
+          <w:sz w:val="24"/>
+        </w:rPr>
+        <w:t>(27), 10155–10162. https://doi.org/10.1073/pnas.0600888103</w:t>
       </w:r>
     </w:p>
     <w:p>
@@ -10500,7 +10500,7 @@
           <w:i w:val="0"/>
           <w:sz w:val="24"/>
         </w:rPr>
-        <w:t xml:space="preserve">Yeatman, J. D., Dougherty, R. F., Ben-Shachar, M., &amp; Wandell, B. A. (2012). Development of white matter and reading skills. </w:t>
+        <w:t xml:space="preserve">Konrad, J., Guo, T., Ufkes, S., Selvanathan, T., Sheng, M., Al-Ajmi, E., Branson, H. M., Chau, V., Ly, L. G., Kelly, E. N., Grunau, R. E., &amp; Miller, S. P. (2024). Socioeconomic status moderates associations between hippocampal development and cognition in preterms. </w:t>
       </w:r>
       <w:r>
         <w:rPr>
@@ -10509,7 +10509,7 @@
           <w:i/>
           <w:sz w:val="24"/>
         </w:rPr>
-        <w:t>Proceedings of the National Academy of Sciences</w:t>
+        <w:t>Annals of Clinical and Translational Neurology</w:t>
       </w:r>
       <w:r>
         <w:rPr>
@@ -10527,16 +10527,16 @@
           <w:i/>
           <w:sz w:val="24"/>
         </w:rPr>
-        <w:t>109</w:t>
-      </w:r>
-      <w:r>
-        <w:rPr>
-          <w:rFonts w:ascii="Times New Roman" w:hAnsi="Times New Roman"/>
-          <w:b w:val="0"/>
-          <w:i w:val="0"/>
-          <w:sz w:val="24"/>
-        </w:rPr>
-        <w:t>(44), E3045–E3053. https://doi.org/10.1073/pnas.1206792X</w:t>
+        <w:t>11</w:t>
+      </w:r>
+      <w:r>
+        <w:rPr>
+          <w:rFonts w:ascii="Times New Roman" w:hAnsi="Times New Roman"/>
+          <w:b w:val="0"/>
+          <w:i w:val="0"/>
+          <w:sz w:val="24"/>
+        </w:rPr>
+        <w:t>(9), 2499–2513. https://doi.org/10.1002/acn3.52168</w:t>
       </w:r>
     </w:p>
     <w:p>
@@ -10551,7 +10551,7 @@
           <w:i w:val="0"/>
           <w:sz w:val="24"/>
         </w:rPr>
-        <w:t xml:space="preserve">Wienke, A.-S., &amp; Mathes, B. (2024). Socioeconomic inequalities affect brain responses of infants growing up in Germany. </w:t>
+        <w:t xml:space="preserve">Lange, N., Froimowitz, M. P., Bigler, E. D., &amp; Lainhart, J. E. (2010). Associations between IQ, total and regional brain volumes, and demography in a large normative sample of healthy children and adolescents. </w:t>
       </w:r>
       <w:r>
         <w:rPr>
@@ -10560,7 +10560,7 @@
           <w:i/>
           <w:sz w:val="24"/>
         </w:rPr>
-        <w:t>Brain Sciences</w:t>
+        <w:t>Developmental Neuropsychology</w:t>
       </w:r>
       <w:r>
         <w:rPr>
@@ -10578,16 +10578,16 @@
           <w:i/>
           <w:sz w:val="24"/>
         </w:rPr>
-        <w:t>14</w:t>
-      </w:r>
-      <w:r>
-        <w:rPr>
-          <w:rFonts w:ascii="Times New Roman" w:hAnsi="Times New Roman"/>
-          <w:b w:val="0"/>
-          <w:i w:val="0"/>
-          <w:sz w:val="24"/>
-        </w:rPr>
-        <w:t>(6), Article 560. https://doi.org/10.3390/brainsci14060560</w:t>
+        <w:t>35</w:t>
+      </w:r>
+      <w:r>
+        <w:rPr>
+          <w:rFonts w:ascii="Times New Roman" w:hAnsi="Times New Roman"/>
+          <w:b w:val="0"/>
+          <w:i w:val="0"/>
+          <w:sz w:val="24"/>
+        </w:rPr>
+        <w:t>(3), 296–317. https://doi.org/10.1080/87565641003696833</w:t>
       </w:r>
     </w:p>
     <w:p>
@@ -10602,7 +10602,7 @@
           <w:i w:val="0"/>
           <w:sz w:val="24"/>
         </w:rPr>
-        <w:t xml:space="preserve">Wijeakumar, S., Kumar, A., Delgado Reyes, L. M., Tiwari, M., &amp; Spencer, J. P. (2019). Early adversity in rural India impacts the brain networks underlying visual working memory. </w:t>
+        <w:t xml:space="preserve">Lupien, S. J., McEwen, B. S., Gunnar, M. R., &amp; Heim, C. (2009). Effects of stress throughout the lifespan on the brain, behaviour and cognition. </w:t>
       </w:r>
       <w:r>
         <w:rPr>
@@ -10611,7 +10611,7 @@
           <w:i/>
           <w:sz w:val="24"/>
         </w:rPr>
-        <w:t>Developmental Science</w:t>
+        <w:t>Nature Reviews Neuroscience</w:t>
       </w:r>
       <w:r>
         <w:rPr>
@@ -10629,16 +10629,16 @@
           <w:i/>
           <w:sz w:val="24"/>
         </w:rPr>
-        <w:t>22</w:t>
-      </w:r>
-      <w:r>
-        <w:rPr>
-          <w:rFonts w:ascii="Times New Roman" w:hAnsi="Times New Roman"/>
-          <w:b w:val="0"/>
-          <w:i w:val="0"/>
-          <w:sz w:val="24"/>
-        </w:rPr>
-        <w:t>(5), Article e12822. https://doi.org/10.1111/desc.12822</w:t>
+        <w:t>10</w:t>
+      </w:r>
+      <w:r>
+        <w:rPr>
+          <w:rFonts w:ascii="Times New Roman" w:hAnsi="Times New Roman"/>
+          <w:b w:val="0"/>
+          <w:i w:val="0"/>
+          <w:sz w:val="24"/>
+        </w:rPr>
+        <w:t>(6), 434–445. https://doi.org/10.1038/nrn2639</w:t>
       </w:r>
     </w:p>
     <w:p>
@@ -10653,7 +10653,7 @@
           <w:i w:val="0"/>
           <w:sz w:val="24"/>
         </w:rPr>
-        <w:t xml:space="preserve">Blair, C., &amp; Raver, C. C. (2016). Poverty, stress, and brain development: New directions for prevention and intervention. </w:t>
+        <w:t xml:space="preserve">Maguire, M. J., &amp; Schneider, J. M. (2019). Socioeconomic status related differences in resting state EEG activity correspond to differences in vocabulary and working memory in grade school. </w:t>
       </w:r>
       <w:r>
         <w:rPr>
@@ -10662,7 +10662,7 @@
           <w:i/>
           <w:sz w:val="24"/>
         </w:rPr>
-        <w:t>Academic Pediatrics</w:t>
+        <w:t>Brain and Cognition</w:t>
       </w:r>
       <w:r>
         <w:rPr>
@@ -10680,16 +10680,16 @@
           <w:i/>
           <w:sz w:val="24"/>
         </w:rPr>
-        <w:t>16</w:t>
-      </w:r>
-      <w:r>
-        <w:rPr>
-          <w:rFonts w:ascii="Times New Roman" w:hAnsi="Times New Roman"/>
-          <w:b w:val="0"/>
-          <w:i w:val="0"/>
-          <w:sz w:val="24"/>
-        </w:rPr>
-        <w:t>(3 Suppl), S30–S36. https://doi.org/10.1016/j.acap.2016.01.010</w:t>
+        <w:t>137</w:t>
+      </w:r>
+      <w:r>
+        <w:rPr>
+          <w:rFonts w:ascii="Times New Roman" w:hAnsi="Times New Roman"/>
+          <w:b w:val="0"/>
+          <w:i w:val="0"/>
+          <w:sz w:val="24"/>
+        </w:rPr>
+        <w:t>, Article 103619. https://doi.org/10.1016/j.bandc.2019.103619</w:t>
       </w:r>
     </w:p>
     <w:p>
@@ -10704,7 +10704,7 @@
           <w:i w:val="0"/>
           <w:sz w:val="24"/>
         </w:rPr>
-        <w:t xml:space="preserve">Hart, B., &amp; Risley, T. R. (1995). </w:t>
+        <w:t xml:space="preserve">Marshall, P. J., &amp; Meltzoff, A. N. (2014). Neural mirroring mechanisms and imitation in human infants. </w:t>
       </w:r>
       <w:r>
         <w:rPr>
@@ -10713,16 +10713,34 @@
           <w:i/>
           <w:sz w:val="24"/>
         </w:rPr>
-        <w:t>Meaningful differences in the everyday experience of young American children</w:t>
-      </w:r>
-      <w:r>
-        <w:rPr>
-          <w:rFonts w:ascii="Times New Roman" w:hAnsi="Times New Roman"/>
-          <w:b w:val="0"/>
-          <w:i w:val="0"/>
-          <w:sz w:val="24"/>
-        </w:rPr>
-        <w:t>. Paul H. Brookes.</w:t>
+        <w:t>Philosophical Transactions of the Royal Society B: Biological Sciences</w:t>
+      </w:r>
+      <w:r>
+        <w:rPr>
+          <w:rFonts w:ascii="Times New Roman" w:hAnsi="Times New Roman"/>
+          <w:b w:val="0"/>
+          <w:i w:val="0"/>
+          <w:sz w:val="24"/>
+        </w:rPr>
+        <w:t xml:space="preserve">, </w:t>
+      </w:r>
+      <w:r>
+        <w:rPr>
+          <w:rFonts w:ascii="Times New Roman" w:hAnsi="Times New Roman"/>
+          <w:b w:val="0"/>
+          <w:i/>
+          <w:sz w:val="24"/>
+        </w:rPr>
+        <w:t>369</w:t>
+      </w:r>
+      <w:r>
+        <w:rPr>
+          <w:rFonts w:ascii="Times New Roman" w:hAnsi="Times New Roman"/>
+          <w:b w:val="0"/>
+          <w:i w:val="0"/>
+          <w:sz w:val="24"/>
+        </w:rPr>
+        <w:t>(1644), Article 20130620. https://doi.org/10.1098/rstb.2013.0620</w:t>
       </w:r>
     </w:p>
     <w:p>
@@ -10737,7 +10755,7 @@
           <w:i w:val="0"/>
           <w:sz w:val="24"/>
         </w:rPr>
-        <w:t xml:space="preserve">Hoff, E. (2003). The specificity of environmental influence: Socioeconomic status affects early vocabulary development via maternal speech. </w:t>
+        <w:t xml:space="preserve">McEwen, B. S., &amp; Gianaros, P. J. (2010). Central role of the brain in stress and adaptation: Links to socioeconomic status, health, and disease. </w:t>
       </w:r>
       <w:r>
         <w:rPr>
@@ -10746,7 +10764,7 @@
           <w:i/>
           <w:sz w:val="24"/>
         </w:rPr>
-        <w:t>Child Development</w:t>
+        <w:t>Annals of the New York Academy of Sciences</w:t>
       </w:r>
       <w:r>
         <w:rPr>
@@ -10764,16 +10782,16 @@
           <w:i/>
           <w:sz w:val="24"/>
         </w:rPr>
-        <w:t>74</w:t>
-      </w:r>
-      <w:r>
-        <w:rPr>
-          <w:rFonts w:ascii="Times New Roman" w:hAnsi="Times New Roman"/>
-          <w:b w:val="0"/>
-          <w:i w:val="0"/>
-          <w:sz w:val="24"/>
-        </w:rPr>
-        <w:t>(5), 1368–1378. https://doi.org/10.1111/1467-8624.00612</w:t>
+        <w:t>1186</w:t>
+      </w:r>
+      <w:r>
+        <w:rPr>
+          <w:rFonts w:ascii="Times New Roman" w:hAnsi="Times New Roman"/>
+          <w:b w:val="0"/>
+          <w:i w:val="0"/>
+          <w:sz w:val="24"/>
+        </w:rPr>
+        <w:t>, 190–222. https://doi.org/10.1111/j.1749-6632.2009.05437.x</w:t>
       </w:r>
     </w:p>
     <w:p>
@@ -10788,7 +10806,7 @@
           <w:i w:val="0"/>
           <w:sz w:val="24"/>
         </w:rPr>
-        <w:t xml:space="preserve">Lupien, S. J., McEwen, B. S., Gunnar, M. R., &amp; Heim, C. (2009). Effects of stress throughout the lifespan on the brain, behaviour and cognition. </w:t>
+        <w:t xml:space="preserve">McKinnon, K., Galdi, P., Blesa-Cábez, M., Sullivan, G., Vaher, K., Corrigan, A., Hall, J., Jiménez-Sánchez, L., Thrippleton, M., Bastin, M. E., Quigley, A. J., Valavani, E., Tsanas, A., Richardson, H., &amp; Boardman, J. P. (2023). Association of preterm birth and socioeconomic status with neonatal brain structure. </w:t>
       </w:r>
       <w:r>
         <w:rPr>
@@ -10797,7 +10815,7 @@
           <w:i/>
           <w:sz w:val="24"/>
         </w:rPr>
-        <w:t>Nature Reviews Neuroscience</w:t>
+        <w:t>JAMA Pediatrics</w:t>
       </w:r>
       <w:r>
         <w:rPr>
@@ -10815,16 +10833,16 @@
           <w:i/>
           <w:sz w:val="24"/>
         </w:rPr>
-        <w:t>10</w:t>
-      </w:r>
-      <w:r>
-        <w:rPr>
-          <w:rFonts w:ascii="Times New Roman" w:hAnsi="Times New Roman"/>
-          <w:b w:val="0"/>
-          <w:i w:val="0"/>
-          <w:sz w:val="24"/>
-        </w:rPr>
-        <w:t>(6), 434–445. https://doi.org/10.1038/nrn2639</w:t>
+        <w:t>177</w:t>
+      </w:r>
+      <w:r>
+        <w:rPr>
+          <w:rFonts w:ascii="Times New Roman" w:hAnsi="Times New Roman"/>
+          <w:b w:val="0"/>
+          <w:i w:val="0"/>
+          <w:sz w:val="24"/>
+        </w:rPr>
+        <w:t>(4), 380–389. https://doi.org/10.1001/jamapediatrics.2022.5847</w:t>
       </w:r>
     </w:p>
     <w:p>
@@ -10839,7 +10857,7 @@
           <w:i w:val="0"/>
           <w:sz w:val="24"/>
         </w:rPr>
-        <w:t xml:space="preserve">Rowe, M. L. (2008). Child-directed speech: Relation to socioeconomic status, knowledge of child development and child vocabulary skill. </w:t>
+        <w:t xml:space="preserve">Monk, C., Georgieff, M. K., &amp; Osterholm, E. A. (2013). Research review: Maternal prenatal distress and poor nutrition—Mutually influencing risk factors affecting infant neurocognitive development. </w:t>
       </w:r>
       <w:r>
         <w:rPr>
@@ -10848,7 +10866,7 @@
           <w:i/>
           <w:sz w:val="24"/>
         </w:rPr>
-        <w:t>Journal of Child Language</w:t>
+        <w:t>Journal of Child Psychology and Psychiatry</w:t>
       </w:r>
       <w:r>
         <w:rPr>
@@ -10866,16 +10884,16 @@
           <w:i/>
           <w:sz w:val="24"/>
         </w:rPr>
-        <w:t>35</w:t>
-      </w:r>
-      <w:r>
-        <w:rPr>
-          <w:rFonts w:ascii="Times New Roman" w:hAnsi="Times New Roman"/>
-          <w:b w:val="0"/>
-          <w:i w:val="0"/>
-          <w:sz w:val="24"/>
-        </w:rPr>
-        <w:t>(1), 185–205. https://doi.org/10.1017/S0305000907008343</w:t>
+        <w:t>54</w:t>
+      </w:r>
+      <w:r>
+        <w:rPr>
+          <w:rFonts w:ascii="Times New Roman" w:hAnsi="Times New Roman"/>
+          <w:b w:val="0"/>
+          <w:i w:val="0"/>
+          <w:sz w:val="24"/>
+        </w:rPr>
+        <w:t>(2), 115–130. https://doi.org/10.1111/jcpp.12000</w:t>
       </w:r>
     </w:p>
     <w:p>
@@ -10890,7 +10908,7 @@
           <w:i w:val="0"/>
           <w:sz w:val="24"/>
         </w:rPr>
-        <w:t xml:space="preserve">Walker, S. P., Wachs, T. D., Grantham-McGregor, S., Black, M. M., Nelson, C. A., Huffman, S. L., Baker-Henningham, H., Chang, S. M., Hamadani, J. D., Lozoff, B., Gardner, J. M. M., Powell, C. A., Rahman, A., &amp; Richter, L. (2011). Inequality in early childhood: Risk and protective factors for early child development. </w:t>
+        <w:t xml:space="preserve">Noble, K. G., Houston, S. M., Brito, N. H., Bartsch, H., Kan, E., Kuperman, J. M., Akshoomoff, N., Amaral, D. G., Bloss, C. S., Libiger, O., Schork, N. J., Murray, S. S., Casey, B. J., Chang, L., Ernst, T. M., Frazier, J. A., Gruen, J. R., Kennedy, D. N., Van Zijl, P., … Sowell, E. R. (2015). Family income, parental education and brain structure in children and adolescents. </w:t>
       </w:r>
       <w:r>
         <w:rPr>
@@ -10899,7 +10917,7 @@
           <w:i/>
           <w:sz w:val="24"/>
         </w:rPr>
-        <w:t>The Lancet</w:t>
+        <w:t>Nature Neuroscience</w:t>
       </w:r>
       <w:r>
         <w:rPr>
@@ -10917,16 +10935,16 @@
           <w:i/>
           <w:sz w:val="24"/>
         </w:rPr>
-        <w:t>378</w:t>
-      </w:r>
-      <w:r>
-        <w:rPr>
-          <w:rFonts w:ascii="Times New Roman" w:hAnsi="Times New Roman"/>
-          <w:b w:val="0"/>
-          <w:i w:val="0"/>
-          <w:sz w:val="24"/>
-        </w:rPr>
-        <w:t>(9799), 1325–1338. https://doi.org/10.1016/S0140-6736(11)60555-2</w:t>
+        <w:t>18</w:t>
+      </w:r>
+      <w:r>
+        <w:rPr>
+          <w:rFonts w:ascii="Times New Roman" w:hAnsi="Times New Roman"/>
+          <w:b w:val="0"/>
+          <w:i w:val="0"/>
+          <w:sz w:val="24"/>
+        </w:rPr>
+        <w:t>(5), 773–778. https://doi.org/10.1038/nn.3983</w:t>
       </w:r>
     </w:p>
     <w:p>
@@ -10941,7 +10959,7 @@
           <w:i w:val="0"/>
           <w:sz w:val="24"/>
         </w:rPr>
-        <w:t xml:space="preserve">Demir-Lira, Ö. E., Prado, J., &amp; Booth, J. R. (2021). Neurocognitive basis of deductive reasoning in children varies with parental education. </w:t>
+        <w:t xml:space="preserve">Ozernov-Palchik, O., Norton, E. S., Wang, Y., Beach, S. D., Zuk, J., Wolf, M., Gabrieli, J. D. E., &amp; Gaab, N. (2019). The relationship between socioeconomic status and white matter microstructure in pre-reading children: A longitudinal investigation. </w:t>
       </w:r>
       <w:r>
         <w:rPr>
@@ -10968,16 +10986,16 @@
           <w:i/>
           <w:sz w:val="24"/>
         </w:rPr>
-        <w:t>42</w:t>
-      </w:r>
-      <w:r>
-        <w:rPr>
-          <w:rFonts w:ascii="Times New Roman" w:hAnsi="Times New Roman"/>
-          <w:b w:val="0"/>
-          <w:i w:val="0"/>
-          <w:sz w:val="24"/>
-        </w:rPr>
-        <w:t>(11), 3396–3410. https://doi.org/10.1002/hbm.25441</w:t>
+        <w:t>40</w:t>
+      </w:r>
+      <w:r>
+        <w:rPr>
+          <w:rFonts w:ascii="Times New Roman" w:hAnsi="Times New Roman"/>
+          <w:b w:val="0"/>
+          <w:i w:val="0"/>
+          <w:sz w:val="24"/>
+        </w:rPr>
+        <w:t>(3), 741–754. https://doi.org/10.1002/hbm.24407</w:t>
       </w:r>
     </w:p>
     <w:p>
@@ -10992,7 +11010,7 @@
           <w:i w:val="0"/>
           <w:sz w:val="24"/>
         </w:rPr>
-        <w:t xml:space="preserve">Konrad, J., Guo, T., Ufkes, S., Selvanathan, T., Sheng, M., Al-Ajmi, E., Branson, H. M., Chau, V., Ly, L. G., Kelly, E. N., Grunau, R. E., &amp; Miller, S. P. (2024). Socioeconomic status moderates associations between hippocampal development and cognition in preterms. </w:t>
+        <w:t xml:space="preserve">Page, M. J., McKenzie, J. E., Bossuyt, P. M., Boutron, I., Hoffmann, T. C., Mulrow, C. D., Shamseer, L., Tetzlaff, J. M., Akl, E. A., Brennan, S. E., Chou, R., Gluud, C., Mayo-Wilson, E., McDonald, S., McGuinness, L. A., Stewart, L. A., Thomas, J., Tricco, A. C., Welch, V. A., … Moher, D. (2021). The PRISMA 2020 statement: An updated guideline for reporting systematic reviews. </w:t>
       </w:r>
       <w:r>
         <w:rPr>
@@ -11001,7 +11019,7 @@
           <w:i/>
           <w:sz w:val="24"/>
         </w:rPr>
-        <w:t>Annals of Clinical and Translational Neurology</w:t>
+        <w:t>BMJ</w:t>
       </w:r>
       <w:r>
         <w:rPr>
@@ -11019,16 +11037,16 @@
           <w:i/>
           <w:sz w:val="24"/>
         </w:rPr>
-        <w:t>11</w:t>
-      </w:r>
-      <w:r>
-        <w:rPr>
-          <w:rFonts w:ascii="Times New Roman" w:hAnsi="Times New Roman"/>
-          <w:b w:val="0"/>
-          <w:i w:val="0"/>
-          <w:sz w:val="24"/>
-        </w:rPr>
-        <w:t>(9), 2499–2513. https://doi.org/10.1002/acn3.52168</w:t>
+        <w:t>372</w:t>
+      </w:r>
+      <w:r>
+        <w:rPr>
+          <w:rFonts w:ascii="Times New Roman" w:hAnsi="Times New Roman"/>
+          <w:b w:val="0"/>
+          <w:i w:val="0"/>
+          <w:sz w:val="24"/>
+        </w:rPr>
+        <w:t>, n71. https://doi.org/10.1136/bmj.n71</w:t>
       </w:r>
     </w:p>
     <w:p>
@@ -11043,7 +11061,7 @@
           <w:i w:val="0"/>
           <w:sz w:val="24"/>
         </w:rPr>
-        <w:t xml:space="preserve">Ozernov-Palchik, O., Norton, E. S., Wang, Y., Beach, S. D., Zuk, J., Wolf, M., Gabrieli, J. D. E., &amp; Gaab, N. (2019). The relationship between socioeconomic status and white matter microstructure in pre-reading children: A longitudinal investigation. </w:t>
+        <w:t xml:space="preserve">Paus, T., Zijdenbos, A., Worsley, K., Collins, D. L., Blumenthal, J., Giedd, J. N., Rapoport, J. L., &amp; Evans, A. C. (1999). Structural maturation of neural pathways in children and adolescents: In vivo study. </w:t>
       </w:r>
       <w:r>
         <w:rPr>
@@ -11052,7 +11070,7 @@
           <w:i/>
           <w:sz w:val="24"/>
         </w:rPr>
-        <w:t>Human Brain Mapping</w:t>
+        <w:t>Science</w:t>
       </w:r>
       <w:r>
         <w:rPr>
@@ -11070,16 +11088,16 @@
           <w:i/>
           <w:sz w:val="24"/>
         </w:rPr>
-        <w:t>40</w:t>
-      </w:r>
-      <w:r>
-        <w:rPr>
-          <w:rFonts w:ascii="Times New Roman" w:hAnsi="Times New Roman"/>
-          <w:b w:val="0"/>
-          <w:i w:val="0"/>
-          <w:sz w:val="24"/>
-        </w:rPr>
-        <w:t>(3), 741–754. https://doi.org/10.1002/hbm.24407</w:t>
+        <w:t>283</w:t>
+      </w:r>
+      <w:r>
+        <w:rPr>
+          <w:rFonts w:ascii="Times New Roman" w:hAnsi="Times New Roman"/>
+          <w:b w:val="0"/>
+          <w:i w:val="0"/>
+          <w:sz w:val="24"/>
+        </w:rPr>
+        <w:t>(5409), 1908–1911. https://doi.org/10.1126/science.283.5409.1908</w:t>
       </w:r>
     </w:p>
     <w:p>
@@ -11094,7 +11112,7 @@
           <w:i w:val="0"/>
           <w:sz w:val="24"/>
         </w:rPr>
-        <w:t xml:space="preserve">Ramphal, B., Whalen, D. J., Kenley, J. K., Yu, Q., Smyser, C. D., Rogers, C. E., &amp; Sylvester, C. M. (2020). Brain connectivity and socioeconomic status at birth and externalizing symptoms at age 2 years. </w:t>
+        <w:t xml:space="preserve">Plomin, R., DeFries, J. C., Knopik, V. S., &amp; Neiderhiser, J. M. (2013). </w:t>
       </w:r>
       <w:r>
         <w:rPr>
@@ -11103,34 +11121,16 @@
           <w:i/>
           <w:sz w:val="24"/>
         </w:rPr>
-        <w:t>Developmental Cognitive Neuroscience</w:t>
-      </w:r>
-      <w:r>
-        <w:rPr>
-          <w:rFonts w:ascii="Times New Roman" w:hAnsi="Times New Roman"/>
-          <w:b w:val="0"/>
-          <w:i w:val="0"/>
-          <w:sz w:val="24"/>
-        </w:rPr>
-        <w:t xml:space="preserve">, </w:t>
-      </w:r>
-      <w:r>
-        <w:rPr>
-          <w:rFonts w:ascii="Times New Roman" w:hAnsi="Times New Roman"/>
-          <w:b w:val="0"/>
-          <w:i/>
-          <w:sz w:val="24"/>
-        </w:rPr>
-        <w:t>45</w:t>
-      </w:r>
-      <w:r>
-        <w:rPr>
-          <w:rFonts w:ascii="Times New Roman" w:hAnsi="Times New Roman"/>
-          <w:b w:val="0"/>
-          <w:i w:val="0"/>
-          <w:sz w:val="24"/>
-        </w:rPr>
-        <w:t>, Article 100811. https://doi.org/10.1016/j.dcn.2020.100811</w:t>
+        <w:t>Behavioral genetics</w:t>
+      </w:r>
+      <w:r>
+        <w:rPr>
+          <w:rFonts w:ascii="Times New Roman" w:hAnsi="Times New Roman"/>
+          <w:b w:val="0"/>
+          <w:i w:val="0"/>
+          <w:sz w:val="24"/>
+        </w:rPr>
+        <w:t xml:space="preserve"> (6th ed.). Worth Publishers.</w:t>
       </w:r>
     </w:p>
     <w:p>
@@ -11145,7 +11145,7 @@
           <w:i w:val="0"/>
           <w:sz w:val="24"/>
         </w:rPr>
-        <w:t xml:space="preserve">Stiver, M. L., Kamino, D., Guo, T., Thompson, A., Duerden, E. G., Taylor, M. J., &amp; Tam, E. W. Y. (2015). Maternal postsecondary education associated with improved cerebellar growth after preterm birth. </w:t>
+        <w:t xml:space="preserve">Ramphal, B., Whalen, D. J., Kenley, J. K., Yu, Q., Smyser, C. D., Rogers, C. E., &amp; Sylvester, C. M. (2020). Brain connectivity and socioeconomic status at birth and externalizing symptoms at age 2 years. </w:t>
       </w:r>
       <w:r>
         <w:rPr>
@@ -11154,7 +11154,7 @@
           <w:i/>
           <w:sz w:val="24"/>
         </w:rPr>
-        <w:t>Journal of Child Neurology</w:t>
+        <w:t>Developmental Cognitive Neuroscience</w:t>
       </w:r>
       <w:r>
         <w:rPr>
@@ -11172,16 +11172,16 @@
           <w:i/>
           <w:sz w:val="24"/>
         </w:rPr>
-        <w:t>30</w:t>
-      </w:r>
-      <w:r>
-        <w:rPr>
-          <w:rFonts w:ascii="Times New Roman" w:hAnsi="Times New Roman"/>
-          <w:b w:val="0"/>
-          <w:i w:val="0"/>
-          <w:sz w:val="24"/>
-        </w:rPr>
-        <w:t>(12), 1633–1639. https://doi.org/10.1177/0883073815576790</w:t>
+        <w:t>45</w:t>
+      </w:r>
+      <w:r>
+        <w:rPr>
+          <w:rFonts w:ascii="Times New Roman" w:hAnsi="Times New Roman"/>
+          <w:b w:val="0"/>
+          <w:i w:val="0"/>
+          <w:sz w:val="24"/>
+        </w:rPr>
+        <w:t>, Article 100811. https://doi.org/10.1016/j.dcn.2020.100811</w:t>
       </w:r>
     </w:p>
     <w:p>
@@ -11196,7 +11196,7 @@
           <w:i w:val="0"/>
           <w:sz w:val="24"/>
         </w:rPr>
-        <w:t xml:space="preserve">Turesky, T. K., Sanfilippo, J., Zuk, J., Ahtam, B., Gagoski, B., Lee, A., Garrisi, K., Dunstan, J., Carruthers, C., Vanderauwera, J., Yu, X., &amp; Gaab, N. (2022). Home language and literacy environment and its relationship to socioeconomic status and white matter structure in infancy. </w:t>
+        <w:t xml:space="preserve">Rowe, M. L. (2008). Child-directed speech: Relation to socioeconomic status, knowledge of child development and child vocabulary skill. </w:t>
       </w:r>
       <w:r>
         <w:rPr>
@@ -11205,7 +11205,7 @@
           <w:i/>
           <w:sz w:val="24"/>
         </w:rPr>
-        <w:t>Brain Structure and Function</w:t>
+        <w:t>Journal of Child Language</w:t>
       </w:r>
       <w:r>
         <w:rPr>
@@ -11223,16 +11223,16 @@
           <w:i/>
           <w:sz w:val="24"/>
         </w:rPr>
-        <w:t>227</w:t>
-      </w:r>
-      <w:r>
-        <w:rPr>
-          <w:rFonts w:ascii="Times New Roman" w:hAnsi="Times New Roman"/>
-          <w:b w:val="0"/>
-          <w:i w:val="0"/>
-          <w:sz w:val="24"/>
-        </w:rPr>
-        <w:t>(8), 2633–2645. https://doi.org/10.1007/s00429-022-02560-4</w:t>
+        <w:t>35</w:t>
+      </w:r>
+      <w:r>
+        <w:rPr>
+          <w:rFonts w:ascii="Times New Roman" w:hAnsi="Times New Roman"/>
+          <w:b w:val="0"/>
+          <w:i w:val="0"/>
+          <w:sz w:val="24"/>
+        </w:rPr>
+        <w:t>(1), 185–205. https://doi.org/10.1017/S0305000907008343</w:t>
       </w:r>
     </w:p>
     <w:p>
@@ -11247,7 +11247,7 @@
           <w:i w:val="0"/>
           <w:sz w:val="24"/>
         </w:rPr>
-        <w:t xml:space="preserve">Ursache, A., &amp; Noble, K. G. (2016). Socioeconomic status, white matter, and executive function in children. </w:t>
+        <w:t xml:space="preserve">Shephard, E., Fatori, D., Mauro, L. R., de Medeiros Filho, M. V., Hoexter, M. Q., Chiesa, A. M., Fracolli, L. A., Brentani, H., Ferraro, A. A., Nelson, C. A., Miguel, E. C., &amp; Polanczyk, G. V. (2019). Effects of maternal psychopathology and education level on neurocognitive development in infants of adolescent mothers living in poverty. </w:t>
       </w:r>
       <w:r>
         <w:rPr>
@@ -11256,7 +11256,7 @@
           <w:i/>
           <w:sz w:val="24"/>
         </w:rPr>
-        <w:t>Brain and Behavior</w:t>
+        <w:t>Biological Psychiatry: Cognitive Neuroscience and Neuroimaging</w:t>
       </w:r>
       <w:r>
         <w:rPr>
@@ -11274,16 +11274,16 @@
           <w:i/>
           <w:sz w:val="24"/>
         </w:rPr>
-        <w:t>6</w:t>
-      </w:r>
-      <w:r>
-        <w:rPr>
-          <w:rFonts w:ascii="Times New Roman" w:hAnsi="Times New Roman"/>
-          <w:b w:val="0"/>
-          <w:i w:val="0"/>
-          <w:sz w:val="24"/>
-        </w:rPr>
-        <w:t>(10), Article e00531. https://doi.org/10.1002/brb3.531</w:t>
+        <w:t>4</w:t>
+      </w:r>
+      <w:r>
+        <w:rPr>
+          <w:rFonts w:ascii="Times New Roman" w:hAnsi="Times New Roman"/>
+          <w:b w:val="0"/>
+          <w:i w:val="0"/>
+          <w:sz w:val="24"/>
+        </w:rPr>
+        <w:t>(11), 1136–1145. https://doi.org/10.1016/j.bpsc.2019.05.009</w:t>
       </w:r>
     </w:p>
     <w:p>
@@ -11298,7 +11298,7 @@
           <w:i w:val="0"/>
           <w:sz w:val="24"/>
         </w:rPr>
-        <w:t xml:space="preserve">Victora, C. G., Adair, L., Fall, C., Hallal, P. C., Martorell, R., Richter, L., &amp; Sachdev, H. S. (2008). Maternal and child undernutrition: Consequences for adult health and human capital. </w:t>
+        <w:t xml:space="preserve">Shonkoff, J. P., Garner, A. S., The Committee on Psychosocial Aspects of Child and Family Health, The Committee on Early Childhood, Adoption, and Dependent Care, &amp; The Section on Developmental and Behavioral Pediatrics. (2012). The lifelong effects of early childhood adversity and toxic stress. </w:t>
       </w:r>
       <w:r>
         <w:rPr>
@@ -11307,7 +11307,7 @@
           <w:i/>
           <w:sz w:val="24"/>
         </w:rPr>
-        <w:t>The Lancet</w:t>
+        <w:t>Pediatrics</w:t>
       </w:r>
       <w:r>
         <w:rPr>
@@ -11325,16 +11325,16 @@
           <w:i/>
           <w:sz w:val="24"/>
         </w:rPr>
-        <w:t>371</w:t>
-      </w:r>
-      <w:r>
-        <w:rPr>
-          <w:rFonts w:ascii="Times New Roman" w:hAnsi="Times New Roman"/>
-          <w:b w:val="0"/>
-          <w:i w:val="0"/>
-          <w:sz w:val="24"/>
-        </w:rPr>
-        <w:t>(9609), 340–357. https://doi.org/10.1016/S0140-6736(07)61692-4</w:t>
+        <w:t>129</w:t>
+      </w:r>
+      <w:r>
+        <w:rPr>
+          <w:rFonts w:ascii="Times New Roman" w:hAnsi="Times New Roman"/>
+          <w:b w:val="0"/>
+          <w:i w:val="0"/>
+          <w:sz w:val="24"/>
+        </w:rPr>
+        <w:t>(1), e232–e246. https://doi.org/10.1542/peds.2011-2663</w:t>
       </w:r>
     </w:p>
     <w:p>
@@ -11349,7 +11349,7 @@
           <w:i w:val="0"/>
           <w:sz w:val="24"/>
         </w:rPr>
-        <w:t xml:space="preserve">Zhu, C., Chen, Y., Müller, H.-G., &amp; Styner, M. A. (2023). Trajectories of brain volumes in young children are associated with maternal education. </w:t>
+        <w:t xml:space="preserve">Sperry, D. E., Sperry, L. L., &amp; Miller, P. J. (2019). Reexamining the verbal environments of children from different socioeconomic backgrounds. </w:t>
       </w:r>
       <w:r>
         <w:rPr>
@@ -11358,7 +11358,7 @@
           <w:i/>
           <w:sz w:val="24"/>
         </w:rPr>
-        <w:t>Human Brain Mapping</w:t>
+        <w:t>Child Development</w:t>
       </w:r>
       <w:r>
         <w:rPr>
@@ -11376,16 +11376,16 @@
           <w:i/>
           <w:sz w:val="24"/>
         </w:rPr>
-        <w:t>44</w:t>
-      </w:r>
-      <w:r>
-        <w:rPr>
-          <w:rFonts w:ascii="Times New Roman" w:hAnsi="Times New Roman"/>
-          <w:b w:val="0"/>
-          <w:i w:val="0"/>
-          <w:sz w:val="24"/>
-        </w:rPr>
-        <w:t>(8), 3060–3073. https://doi.org/10.1002/hbm.26271</w:t>
+        <w:t>90</w:t>
+      </w:r>
+      <w:r>
+        <w:rPr>
+          <w:rFonts w:ascii="Times New Roman" w:hAnsi="Times New Roman"/>
+          <w:b w:val="0"/>
+          <w:i w:val="0"/>
+          <w:sz w:val="24"/>
+        </w:rPr>
+        <w:t>(4), 1303–1318. https://doi.org/10.1111/cdev.13072</w:t>
       </w:r>
     </w:p>
     <w:p>
@@ -11400,7 +11400,7 @@
           <w:i w:val="0"/>
           <w:sz w:val="24"/>
         </w:rPr>
-        <w:t xml:space="preserve">Friederici, A. D. (2012). Language development and the ontogeny of the dorsal pathway. </w:t>
+        <w:t xml:space="preserve">Stiles, J., &amp; Jernigan, T. L. (2010). The basics of brain development. </w:t>
       </w:r>
       <w:r>
         <w:rPr>
@@ -11409,7 +11409,7 @@
           <w:i/>
           <w:sz w:val="24"/>
         </w:rPr>
-        <w:t>Frontiers in Evolutionary Neuroscience</w:t>
+        <w:t>Neuropsychology Review</w:t>
       </w:r>
       <w:r>
         <w:rPr>
@@ -11427,16 +11427,16 @@
           <w:i/>
           <w:sz w:val="24"/>
         </w:rPr>
-        <w:t>4</w:t>
-      </w:r>
-      <w:r>
-        <w:rPr>
-          <w:rFonts w:ascii="Times New Roman" w:hAnsi="Times New Roman"/>
-          <w:b w:val="0"/>
-          <w:i w:val="0"/>
-          <w:sz w:val="24"/>
-        </w:rPr>
-        <w:t>, Article 3. https://doi.org/10.3389/fnevo.2012.00003</w:t>
+        <w:t>20</w:t>
+      </w:r>
+      <w:r>
+        <w:rPr>
+          <w:rFonts w:ascii="Times New Roman" w:hAnsi="Times New Roman"/>
+          <w:b w:val="0"/>
+          <w:i w:val="0"/>
+          <w:sz w:val="24"/>
+        </w:rPr>
+        <w:t>(4), 327–348. https://doi.org/10.1007/s11065-010-9148-4</w:t>
       </w:r>
     </w:p>
     <w:p>
@@ -11451,7 +11451,7 @@
           <w:i w:val="0"/>
           <w:sz w:val="24"/>
         </w:rPr>
-        <w:t xml:space="preserve">Friederici, A. D. (2016). The ontogeny of the cortical language network. </w:t>
+        <w:t xml:space="preserve">Stiver, M. L., Kamino, D., Guo, T., Thompson, A., Duerden, E. G., Taylor, M. J., &amp; Tam, E. W. Y. (2015). Maternal postsecondary education associated with improved cerebellar growth after preterm birth. </w:t>
       </w:r>
       <w:r>
         <w:rPr>
@@ -11460,7 +11460,7 @@
           <w:i/>
           <w:sz w:val="24"/>
         </w:rPr>
-        <w:t>Nature Reviews Neuroscience</w:t>
+        <w:t>Journal of Child Neurology</w:t>
       </w:r>
       <w:r>
         <w:rPr>
@@ -11478,16 +11478,16 @@
           <w:i/>
           <w:sz w:val="24"/>
         </w:rPr>
-        <w:t>17</w:t>
-      </w:r>
-      <w:r>
-        <w:rPr>
-          <w:rFonts w:ascii="Times New Roman" w:hAnsi="Times New Roman"/>
-          <w:b w:val="0"/>
-          <w:i w:val="0"/>
-          <w:sz w:val="24"/>
-        </w:rPr>
-        <w:t>(5), 323–332. https://doi.org/10.1038/nrn.2016.23</w:t>
+        <w:t>30</w:t>
+      </w:r>
+      <w:r>
+        <w:rPr>
+          <w:rFonts w:ascii="Times New Roman" w:hAnsi="Times New Roman"/>
+          <w:b w:val="0"/>
+          <w:i w:val="0"/>
+          <w:sz w:val="24"/>
+        </w:rPr>
+        <w:t>(12), 1633–1639. https://doi.org/10.1177/0883073815576790</w:t>
       </w:r>
     </w:p>
     <w:p>
@@ -11502,7 +11502,7 @@
           <w:i w:val="0"/>
           <w:sz w:val="24"/>
         </w:rPr>
-        <w:t xml:space="preserve">Gilkerson, J., Richards, J. A., Warren, S. F., Montgomery, J. K., Greenwood, C. R., Kimbrough Oller, D., Hansen, J. H. L., &amp; Paul, T. D. (2017). Mapping the early language environment using all-day recordings and automated analysis. </w:t>
+        <w:t xml:space="preserve">Tomalski, P., &amp; Johnson, M. H. (2010). The effects of early adversity on the adult and developing brain. </w:t>
       </w:r>
       <w:r>
         <w:rPr>
@@ -11511,7 +11511,7 @@
           <w:i/>
           <w:sz w:val="24"/>
         </w:rPr>
-        <w:t>American Journal of Speech-Language Pathology</w:t>
+        <w:t>Current Opinion in Psychiatry</w:t>
       </w:r>
       <w:r>
         <w:rPr>
@@ -11529,16 +11529,16 @@
           <w:i/>
           <w:sz w:val="24"/>
         </w:rPr>
-        <w:t>26</w:t>
-      </w:r>
-      <w:r>
-        <w:rPr>
-          <w:rFonts w:ascii="Times New Roman" w:hAnsi="Times New Roman"/>
-          <w:b w:val="0"/>
-          <w:i w:val="0"/>
-          <w:sz w:val="24"/>
-        </w:rPr>
-        <w:t>(2), 248–265. https://doi.org/10.1044/2016_AJSLP-15-0169</w:t>
+        <w:t>23</w:t>
+      </w:r>
+      <w:r>
+        <w:rPr>
+          <w:rFonts w:ascii="Times New Roman" w:hAnsi="Times New Roman"/>
+          <w:b w:val="0"/>
+          <w:i w:val="0"/>
+          <w:sz w:val="24"/>
+        </w:rPr>
+        <w:t>(3), 233–238. https://doi.org/10.1097/YCO.0b013e3283387d9f</w:t>
       </w:r>
     </w:p>
     <w:p>
@@ -11553,7 +11553,7 @@
           <w:i w:val="0"/>
           <w:sz w:val="24"/>
         </w:rPr>
-        <w:t xml:space="preserve">Hair, N. L., Hanson, J. L., Wolfe, B. L., &amp; Pollak, S. D. (2015). Association of child poverty, brain development, and academic achievement. </w:t>
+        <w:t xml:space="preserve">Torpey, D. C., Hajcak, G., &amp; Klein, D. N. (2009). An examination of error-related brain activity and its modulation by error value in young children. </w:t>
       </w:r>
       <w:r>
         <w:rPr>
@@ -11562,7 +11562,7 @@
           <w:i/>
           <w:sz w:val="24"/>
         </w:rPr>
-        <w:t>JAMA Pediatrics</w:t>
+        <w:t>Developmental Neuropsychology</w:t>
       </w:r>
       <w:r>
         <w:rPr>
@@ -11580,16 +11580,16 @@
           <w:i/>
           <w:sz w:val="24"/>
         </w:rPr>
-        <w:t>169</w:t>
-      </w:r>
-      <w:r>
-        <w:rPr>
-          <w:rFonts w:ascii="Times New Roman" w:hAnsi="Times New Roman"/>
-          <w:b w:val="0"/>
-          <w:i w:val="0"/>
-          <w:sz w:val="24"/>
-        </w:rPr>
-        <w:t>(9), 822–829. https://doi.org/10.1001/jamapediatrics.2015.1475</w:t>
+        <w:t>34</w:t>
+      </w:r>
+      <w:r>
+        <w:rPr>
+          <w:rFonts w:ascii="Times New Roman" w:hAnsi="Times New Roman"/>
+          <w:b w:val="0"/>
+          <w:i w:val="0"/>
+          <w:sz w:val="24"/>
+        </w:rPr>
+        <w:t>(6), 749–761. https://doi.org/10.1080/87565640903265103</w:t>
       </w:r>
     </w:p>
     <w:p>
@@ -11604,7 +11604,7 @@
           <w:i w:val="0"/>
           <w:sz w:val="24"/>
         </w:rPr>
-        <w:t xml:space="preserve">Huttenlocher, P. R., &amp; Dabholkar, A. S. (1997). Regional differences in synaptogenesis in human cerebral cortex. </w:t>
+        <w:t xml:space="preserve">Turesky, T. K., Sanfilippo, J., Zuk, J., Ahtam, B., Gagoski, B., Lee, A., Garrisi, K., Dunstan, J., Carruthers, C., Vanderauwera, J., Yu, X., &amp; Gaab, N. (2022). Home language and literacy environment and its relationship to socioeconomic status and white matter structure in infancy. </w:t>
       </w:r>
       <w:r>
         <w:rPr>
@@ -11613,7 +11613,7 @@
           <w:i/>
           <w:sz w:val="24"/>
         </w:rPr>
-        <w:t>Journal of Comparative Neurology</w:t>
+        <w:t>Brain Structure and Function</w:t>
       </w:r>
       <w:r>
         <w:rPr>
@@ -11631,16 +11631,16 @@
           <w:i/>
           <w:sz w:val="24"/>
         </w:rPr>
-        <w:t>387</w:t>
-      </w:r>
-      <w:r>
-        <w:rPr>
-          <w:rFonts w:ascii="Times New Roman" w:hAnsi="Times New Roman"/>
-          <w:b w:val="0"/>
-          <w:i w:val="0"/>
-          <w:sz w:val="24"/>
-        </w:rPr>
-        <w:t>(2), 167–178. https://doi.org/10.1002/(SICI)1096-9861(19971020)387:2&lt;167::AID-CNE1&gt;3.0.CO;2-Z</w:t>
+        <w:t>227</w:t>
+      </w:r>
+      <w:r>
+        <w:rPr>
+          <w:rFonts w:ascii="Times New Roman" w:hAnsi="Times New Roman"/>
+          <w:b w:val="0"/>
+          <w:i w:val="0"/>
+          <w:sz w:val="24"/>
+        </w:rPr>
+        <w:t>(8), 2633–2645. https://doi.org/10.1007/s00429-022-02560-4</w:t>
       </w:r>
     </w:p>
     <w:p>
@@ -11655,7 +11655,7 @@
           <w:i w:val="0"/>
           <w:sz w:val="24"/>
         </w:rPr>
-        <w:t xml:space="preserve">Knudsen, E. I., Heckman, J. J., Cameron, J. L., &amp; Shonkoff, J. P. (2006). Economic, neurobiological, and behavioral perspectives on building America's future workforce. </w:t>
+        <w:t xml:space="preserve">Ursache, A., &amp; Noble, K. G. (2016). Socioeconomic status, white matter, and executive function in children. </w:t>
       </w:r>
       <w:r>
         <w:rPr>
@@ -11664,7 +11664,7 @@
           <w:i/>
           <w:sz w:val="24"/>
         </w:rPr>
-        <w:t>Proceedings of the National Academy of Sciences</w:t>
+        <w:t>Brain and Behavior</w:t>
       </w:r>
       <w:r>
         <w:rPr>
@@ -11682,16 +11682,16 @@
           <w:i/>
           <w:sz w:val="24"/>
         </w:rPr>
-        <w:t>103</w:t>
-      </w:r>
-      <w:r>
-        <w:rPr>
-          <w:rFonts w:ascii="Times New Roman" w:hAnsi="Times New Roman"/>
-          <w:b w:val="0"/>
-          <w:i w:val="0"/>
-          <w:sz w:val="24"/>
-        </w:rPr>
-        <w:t>(27), 10155–10162. https://doi.org/10.1073/pnas.0600888103</w:t>
+        <w:t>6</w:t>
+      </w:r>
+      <w:r>
+        <w:rPr>
+          <w:rFonts w:ascii="Times New Roman" w:hAnsi="Times New Roman"/>
+          <w:b w:val="0"/>
+          <w:i w:val="0"/>
+          <w:sz w:val="24"/>
+        </w:rPr>
+        <w:t>(10), Article e00531. https://doi.org/10.1002/brb3.531</w:t>
       </w:r>
     </w:p>
     <w:p>
@@ -11706,7 +11706,7 @@
           <w:i w:val="0"/>
           <w:sz w:val="24"/>
         </w:rPr>
-        <w:t xml:space="preserve">Marshall, P. J., &amp; Meltzoff, A. N. (2014). Neural mirroring mechanisms and imitation in human infants. </w:t>
+        <w:t xml:space="preserve">van Veen, V., &amp; Carter, C. S. (2002). The anterior cingulate as a conflict monitor: fMRI and ERP studies. </w:t>
       </w:r>
       <w:r>
         <w:rPr>
@@ -11715,7 +11715,7 @@
           <w:i/>
           <w:sz w:val="24"/>
         </w:rPr>
-        <w:t>Philosophical Transactions of the Royal Society B: Biological Sciences</w:t>
+        <w:t>Physiology &amp; Behavior</w:t>
       </w:r>
       <w:r>
         <w:rPr>
@@ -11733,16 +11733,16 @@
           <w:i/>
           <w:sz w:val="24"/>
         </w:rPr>
-        <w:t>369</w:t>
-      </w:r>
-      <w:r>
-        <w:rPr>
-          <w:rFonts w:ascii="Times New Roman" w:hAnsi="Times New Roman"/>
-          <w:b w:val="0"/>
-          <w:i w:val="0"/>
-          <w:sz w:val="24"/>
-        </w:rPr>
-        <w:t>(1644), Article 20130620. https://doi.org/10.1098/rstb.2013.0620</w:t>
+        <w:t>77</w:t>
+      </w:r>
+      <w:r>
+        <w:rPr>
+          <w:rFonts w:ascii="Times New Roman" w:hAnsi="Times New Roman"/>
+          <w:b w:val="0"/>
+          <w:i w:val="0"/>
+          <w:sz w:val="24"/>
+        </w:rPr>
+        <w:t>(4–5), 477–482. https://doi.org/10.1016/S0031-9384(02)00930-7</w:t>
       </w:r>
     </w:p>
     <w:p>
@@ -11757,7 +11757,7 @@
           <w:i w:val="0"/>
           <w:sz w:val="24"/>
         </w:rPr>
-        <w:t xml:space="preserve">Monk, C., Georgieff, M. K., &amp; Osterholm, E. A. (2013). Research review: Maternal prenatal distress and poor nutrition—Mutually influencing risk factors affecting infant neurocognitive development. </w:t>
+        <w:t xml:space="preserve">Victora, C. G., Adair, L., Fall, C., Hallal, P. C., Martorell, R., Richter, L., &amp; Sachdev, H. S. (2008). Maternal and child undernutrition: Consequences for adult health and human capital. </w:t>
       </w:r>
       <w:r>
         <w:rPr>
@@ -11766,7 +11766,7 @@
           <w:i/>
           <w:sz w:val="24"/>
         </w:rPr>
-        <w:t>Journal of Child Psychology and Psychiatry</w:t>
+        <w:t>The Lancet</w:t>
       </w:r>
       <w:r>
         <w:rPr>
@@ -11784,16 +11784,16 @@
           <w:i/>
           <w:sz w:val="24"/>
         </w:rPr>
-        <w:t>54</w:t>
-      </w:r>
-      <w:r>
-        <w:rPr>
-          <w:rFonts w:ascii="Times New Roman" w:hAnsi="Times New Roman"/>
-          <w:b w:val="0"/>
-          <w:i w:val="0"/>
-          <w:sz w:val="24"/>
-        </w:rPr>
-        <w:t>(2), 115–130. https://doi.org/10.1111/jcpp.12000</w:t>
+        <w:t>371</w:t>
+      </w:r>
+      <w:r>
+        <w:rPr>
+          <w:rFonts w:ascii="Times New Roman" w:hAnsi="Times New Roman"/>
+          <w:b w:val="0"/>
+          <w:i w:val="0"/>
+          <w:sz w:val="24"/>
+        </w:rPr>
+        <w:t>(9609), 340–357. https://doi.org/10.1016/S0140-6736(07)61692-4</w:t>
       </w:r>
     </w:p>
     <w:p>
@@ -11808,7 +11808,7 @@
           <w:i w:val="0"/>
           <w:sz w:val="24"/>
         </w:rPr>
-        <w:t xml:space="preserve">Paus, T., Zijdenbos, A., Worsley, K., Collins, D. L., Blumenthal, J., Giedd, J. N., Rapoport, J. L., &amp; Evans, A. C. (1999). Structural maturation of neural pathways in children and adolescents: In vivo study. </w:t>
+        <w:t xml:space="preserve">Walker, S. P., Wachs, T. D., Grantham-McGregor, S., Black, M. M., Nelson, C. A., Huffman, S. L., Baker-Henningham, H., Chang, S. M., Hamadani, J. D., Lozoff, B., Gardner, J. M. M., Powell, C. A., Rahman, A., &amp; Richter, L. (2011). Inequality in early childhood: Risk and protective factors for early child development. </w:t>
       </w:r>
       <w:r>
         <w:rPr>
@@ -11817,7 +11817,7 @@
           <w:i/>
           <w:sz w:val="24"/>
         </w:rPr>
-        <w:t>Science</w:t>
+        <w:t>The Lancet</w:t>
       </w:r>
       <w:r>
         <w:rPr>
@@ -11835,16 +11835,16 @@
           <w:i/>
           <w:sz w:val="24"/>
         </w:rPr>
-        <w:t>283</w:t>
-      </w:r>
-      <w:r>
-        <w:rPr>
-          <w:rFonts w:ascii="Times New Roman" w:hAnsi="Times New Roman"/>
-          <w:b w:val="0"/>
-          <w:i w:val="0"/>
-          <w:sz w:val="24"/>
-        </w:rPr>
-        <w:t>(5409), 1908–1911. https://doi.org/10.1126/science.283.5409.1908</w:t>
+        <w:t>378</w:t>
+      </w:r>
+      <w:r>
+        <w:rPr>
+          <w:rFonts w:ascii="Times New Roman" w:hAnsi="Times New Roman"/>
+          <w:b w:val="0"/>
+          <w:i w:val="0"/>
+          <w:sz w:val="24"/>
+        </w:rPr>
+        <w:t>(9799), 1325–1338. https://doi.org/10.1016/S0140-6736(11)60555-2</w:t>
       </w:r>
     </w:p>
     <w:p>
@@ -11859,7 +11859,7 @@
           <w:i w:val="0"/>
           <w:sz w:val="24"/>
         </w:rPr>
-        <w:t xml:space="preserve">Shonkoff, J. P., Garner, A. S., The Committee on Psychosocial Aspects of Child and Family Health, The Committee on Early Childhood, Adoption, and Dependent Care, &amp; The Section on Developmental and Behavioral Pediatrics. (2012). The lifelong effects of early childhood adversity and toxic stress. </w:t>
+        <w:t xml:space="preserve">Wells, G. A., Shea, B., O'Connell, D., Peterson, J., Welch, V., Losos, M., &amp; Tugwell, P. (2000). </w:t>
       </w:r>
       <w:r>
         <w:rPr>
@@ -11868,34 +11868,16 @@
           <w:i/>
           <w:sz w:val="24"/>
         </w:rPr>
-        <w:t>Pediatrics</w:t>
-      </w:r>
-      <w:r>
-        <w:rPr>
-          <w:rFonts w:ascii="Times New Roman" w:hAnsi="Times New Roman"/>
-          <w:b w:val="0"/>
-          <w:i w:val="0"/>
-          <w:sz w:val="24"/>
-        </w:rPr>
-        <w:t xml:space="preserve">, </w:t>
-      </w:r>
-      <w:r>
-        <w:rPr>
-          <w:rFonts w:ascii="Times New Roman" w:hAnsi="Times New Roman"/>
-          <w:b w:val="0"/>
-          <w:i/>
-          <w:sz w:val="24"/>
-        </w:rPr>
-        <w:t>129</w:t>
-      </w:r>
-      <w:r>
-        <w:rPr>
-          <w:rFonts w:ascii="Times New Roman" w:hAnsi="Times New Roman"/>
-          <w:b w:val="0"/>
-          <w:i w:val="0"/>
-          <w:sz w:val="24"/>
-        </w:rPr>
-        <w:t>(1), e232–e246. https://doi.org/10.1542/peds.2011-2663</w:t>
+        <w:t>The Newcastle–Ottawa Scale (NOS) for assessing the quality of nonrandomised studies in meta-analyses</w:t>
+      </w:r>
+      <w:r>
+        <w:rPr>
+          <w:rFonts w:ascii="Times New Roman" w:hAnsi="Times New Roman"/>
+          <w:b w:val="0"/>
+          <w:i w:val="0"/>
+          <w:sz w:val="24"/>
+        </w:rPr>
+        <w:t>. Ottawa Hospital Research Institute. http://www.ohri.ca/programs/clinical_epidemiology/oxford.asp</w:t>
       </w:r>
     </w:p>
     <w:p>
@@ -11910,7 +11892,7 @@
           <w:i w:val="0"/>
           <w:sz w:val="24"/>
         </w:rPr>
-        <w:t xml:space="preserve">Torpey, D. C., Hajcak, G., &amp; Klein, D. N. (2009). An examination of error-related brain activity and its modulation by error value in young children. </w:t>
+        <w:t xml:space="preserve">Wienke, A.-S., &amp; Mathes, B. (2024). Socioeconomic inequalities affect brain responses of infants growing up in Germany. </w:t>
       </w:r>
       <w:r>
         <w:rPr>
@@ -11919,7 +11901,7 @@
           <w:i/>
           <w:sz w:val="24"/>
         </w:rPr>
-        <w:t>Developmental Neuropsychology</w:t>
+        <w:t>Brain Sciences</w:t>
       </w:r>
       <w:r>
         <w:rPr>
@@ -11937,16 +11919,16 @@
           <w:i/>
           <w:sz w:val="24"/>
         </w:rPr>
-        <w:t>34</w:t>
-      </w:r>
-      <w:r>
-        <w:rPr>
-          <w:rFonts w:ascii="Times New Roman" w:hAnsi="Times New Roman"/>
-          <w:b w:val="0"/>
-          <w:i w:val="0"/>
-          <w:sz w:val="24"/>
-        </w:rPr>
-        <w:t>(6), 749–761. https://doi.org/10.1080/87565640903265103</w:t>
+        <w:t>14</w:t>
+      </w:r>
+      <w:r>
+        <w:rPr>
+          <w:rFonts w:ascii="Times New Roman" w:hAnsi="Times New Roman"/>
+          <w:b w:val="0"/>
+          <w:i w:val="0"/>
+          <w:sz w:val="24"/>
+        </w:rPr>
+        <w:t>(6), Article 560. https://doi.org/10.3390/brainsci14060560</w:t>
       </w:r>
     </w:p>
     <w:p>
@@ -11961,7 +11943,7 @@
           <w:i w:val="0"/>
           <w:sz w:val="24"/>
         </w:rPr>
-        <w:t xml:space="preserve">van Veen, V., &amp; Carter, C. S. (2002). The anterior cingulate as a conflict monitor: fMRI and ERP studies. </w:t>
+        <w:t xml:space="preserve">Wijeakumar, S., Kumar, A., Delgado Reyes, L. M., Tiwari, M., &amp; Spencer, J. P. (2019). Early adversity in rural India impacts the brain networks underlying visual working memory. </w:t>
       </w:r>
       <w:r>
         <w:rPr>
@@ -11970,7 +11952,7 @@
           <w:i/>
           <w:sz w:val="24"/>
         </w:rPr>
-        <w:t>Physiology &amp; Behavior</w:t>
+        <w:t>Developmental Science</w:t>
       </w:r>
       <w:r>
         <w:rPr>
@@ -11988,16 +11970,16 @@
           <w:i/>
           <w:sz w:val="24"/>
         </w:rPr>
-        <w:t>77</w:t>
-      </w:r>
-      <w:r>
-        <w:rPr>
-          <w:rFonts w:ascii="Times New Roman" w:hAnsi="Times New Roman"/>
-          <w:b w:val="0"/>
-          <w:i w:val="0"/>
-          <w:sz w:val="24"/>
-        </w:rPr>
-        <w:t>(4–5), 477–482. https://doi.org/10.1016/S0031-9384(02)00930-7</w:t>
+        <w:t>22</w:t>
+      </w:r>
+      <w:r>
+        <w:rPr>
+          <w:rFonts w:ascii="Times New Roman" w:hAnsi="Times New Roman"/>
+          <w:b w:val="0"/>
+          <w:i w:val="0"/>
+          <w:sz w:val="24"/>
+        </w:rPr>
+        <w:t>(5), Article e12822. https://doi.org/10.1111/desc.12822</w:t>
       </w:r>
     </w:p>
     <w:p>
@@ -12012,7 +11994,7 @@
           <w:i w:val="0"/>
           <w:sz w:val="24"/>
         </w:rPr>
-        <w:t xml:space="preserve">Plomin, R., DeFries, J. C., Knopik, V. S., &amp; Neiderhiser, J. M. (2013). </w:t>
+        <w:t xml:space="preserve">Yeatman, J. D., Dougherty, R. F., Ben-Shachar, M., &amp; Wandell, B. A. (2012). Development of white matter and reading skills. </w:t>
       </w:r>
       <w:r>
         <w:rPr>
@@ -12021,16 +12003,34 @@
           <w:i/>
           <w:sz w:val="24"/>
         </w:rPr>
-        <w:t>Behavioral genetics</w:t>
-      </w:r>
-      <w:r>
-        <w:rPr>
-          <w:rFonts w:ascii="Times New Roman" w:hAnsi="Times New Roman"/>
-          <w:b w:val="0"/>
-          <w:i w:val="0"/>
-          <w:sz w:val="24"/>
-        </w:rPr>
-        <w:t xml:space="preserve"> (6th ed.). Worth Publishers.</w:t>
+        <w:t>Proceedings of the National Academy of Sciences</w:t>
+      </w:r>
+      <w:r>
+        <w:rPr>
+          <w:rFonts w:ascii="Times New Roman" w:hAnsi="Times New Roman"/>
+          <w:b w:val="0"/>
+          <w:i w:val="0"/>
+          <w:sz w:val="24"/>
+        </w:rPr>
+        <w:t xml:space="preserve">, </w:t>
+      </w:r>
+      <w:r>
+        <w:rPr>
+          <w:rFonts w:ascii="Times New Roman" w:hAnsi="Times New Roman"/>
+          <w:b w:val="0"/>
+          <w:i/>
+          <w:sz w:val="24"/>
+        </w:rPr>
+        <w:t>109</w:t>
+      </w:r>
+      <w:r>
+        <w:rPr>
+          <w:rFonts w:ascii="Times New Roman" w:hAnsi="Times New Roman"/>
+          <w:b w:val="0"/>
+          <w:i w:val="0"/>
+          <w:sz w:val="24"/>
+        </w:rPr>
+        <w:t>(44), E3045–E3053. https://doi.org/10.1073/pnas.1206792X</w:t>
       </w:r>
     </w:p>
     <w:p>
@@ -12045,7 +12045,7 @@
           <w:i w:val="0"/>
           <w:sz w:val="24"/>
         </w:rPr>
-        <w:t xml:space="preserve">Sperry, D. E., Sperry, L. L., &amp; Miller, P. J. (2019). Reexamining the verbal environments of children from different socioeconomic backgrounds. </w:t>
+        <w:t xml:space="preserve">Zhu, C., Chen, Y., Müller, H.-G., &amp; Styner, M. A. (2023). Trajectories of brain volumes in young children are associated with maternal education. </w:t>
       </w:r>
       <w:r>
         <w:rPr>
@@ -12054,7 +12054,7 @@
           <w:i/>
           <w:sz w:val="24"/>
         </w:rPr>
-        <w:t>Child Development</w:t>
+        <w:t>Human Brain Mapping</w:t>
       </w:r>
       <w:r>
         <w:rPr>
@@ -12072,16 +12072,16 @@
           <w:i/>
           <w:sz w:val="24"/>
         </w:rPr>
-        <w:t>90</w:t>
-      </w:r>
-      <w:r>
-        <w:rPr>
-          <w:rFonts w:ascii="Times New Roman" w:hAnsi="Times New Roman"/>
-          <w:b w:val="0"/>
-          <w:i w:val="0"/>
-          <w:sz w:val="24"/>
-        </w:rPr>
-        <w:t>(4), 1303–1318. https://doi.org/10.1111/cdev.13072</w:t>
+        <w:t>44</w:t>
+      </w:r>
+      <w:r>
+        <w:rPr>
+          <w:rFonts w:ascii="Times New Roman" w:hAnsi="Times New Roman"/>
+          <w:b w:val="0"/>
+          <w:i w:val="0"/>
+          <w:sz w:val="24"/>
+        </w:rPr>
+        <w:t>(8), 3060–3073. https://doi.org/10.1002/hbm.26271</w:t>
       </w:r>
     </w:p>
     <w:p>

</xml_diff>